<commit_message>
Finalmente documento exportado funcionado 100%
</commit_message>
<xml_diff>
--- a/GsdAutomatico/pdf/MODELO_NPD.docx
+++ b/GsdAutomatico/pdf/MODELO_NPD.docx
@@ -6,7 +6,7 @@
       <w:pPr>
         <w:pStyle w:val="922"/>
         <w:pBdr/>
-        <w:spacing w:after="0" w:afterAutospacing="0" w:before="0" w:beforeAutospacing="0" w:line="240" w:lineRule="auto"/>
+        <w:spacing w:after="28" w:afterAutospacing="0" w:before="0" w:beforeAutospacing="0" w:line="240" w:lineRule="auto"/>
         <w:ind/>
         <w:jc w:val="center"/>
         <w:rPr>
@@ -34,7 +34,7 @@
       </w:r>
       <w:r>
         <w:rPr>
-          <w:rFonts w:ascii="Times New Roman" w:hAnsi="Times New Roman" w:eastAsia="Times New Roman" w:cs="Times New Roman"/>
+          <w:rFonts w:ascii="Times New Roman" w:hAnsi="Times New Roman" w:cs="Times New Roman"/>
           <w:sz w:val="24"/>
           <w:szCs w:val="24"/>
         </w:rPr>
@@ -44,7 +44,7 @@
       <w:pPr>
         <w:pStyle w:val="922"/>
         <w:pBdr/>
-        <w:spacing w:after="0" w:afterAutospacing="0" w:before="0" w:beforeAutospacing="0" w:line="240" w:lineRule="auto"/>
+        <w:spacing w:after="28" w:afterAutospacing="0" w:before="0" w:beforeAutospacing="0" w:line="240" w:lineRule="auto"/>
         <w:ind/>
         <w:jc w:val="center"/>
         <w:rPr>
@@ -77,7 +77,7 @@
       </w:r>
       <w:r>
         <w:rPr>
-          <w:rFonts w:ascii="Times New Roman" w:hAnsi="Times New Roman" w:eastAsia="Times New Roman" w:cs="Times New Roman"/>
+          <w:rFonts w:ascii="Times New Roman" w:hAnsi="Times New Roman" w:cs="Times New Roman"/>
           <w:b w:val="0"/>
           <w:bCs w:val="0"/>
           <w:sz w:val="24"/>
@@ -89,7 +89,7 @@
       <w:pPr>
         <w:pStyle w:val="922"/>
         <w:pBdr/>
-        <w:spacing w:after="0" w:afterAutospacing="0" w:before="0" w:beforeAutospacing="0" w:line="240" w:lineRule="auto"/>
+        <w:spacing w:after="28" w:afterAutospacing="0" w:before="0" w:beforeAutospacing="0" w:line="240" w:lineRule="auto"/>
         <w:ind/>
         <w:jc w:val="center"/>
         <w:rPr>
@@ -122,7 +122,7 @@
       </w:r>
       <w:r>
         <w:rPr>
-          <w:rFonts w:ascii="Times New Roman" w:hAnsi="Times New Roman" w:eastAsia="Times New Roman" w:cs="Times New Roman"/>
+          <w:rFonts w:ascii="Times New Roman" w:hAnsi="Times New Roman" w:cs="Times New Roman"/>
           <w:b w:val="0"/>
           <w:bCs w:val="0"/>
           <w:sz w:val="24"/>
@@ -134,7 +134,7 @@
       <w:pPr>
         <w:pStyle w:val="922"/>
         <w:pBdr/>
-        <w:spacing w:after="0" w:afterAutospacing="0" w:before="0" w:beforeAutospacing="0" w:line="240" w:lineRule="auto"/>
+        <w:spacing w:after="28" w:afterAutospacing="0" w:before="0" w:beforeAutospacing="0" w:line="240" w:lineRule="auto"/>
         <w:ind/>
         <w:jc w:val="center"/>
         <w:rPr>
@@ -180,7 +180,7 @@
       </w:r>
       <w:r>
         <w:rPr>
-          <w:rFonts w:ascii="Times New Roman" w:hAnsi="Times New Roman" w:eastAsia="Times New Roman" w:cs="Times New Roman"/>
+          <w:rFonts w:ascii="Times New Roman" w:hAnsi="Times New Roman" w:cs="Times New Roman"/>
           <w:b w:val="0"/>
           <w:bCs w:val="0"/>
           <w:color w:val="ff0000"/>
@@ -193,7 +193,7 @@
       <w:pPr>
         <w:pStyle w:val="919"/>
         <w:pBdr/>
-        <w:spacing w:after="0" w:afterAutospacing="0" w:before="0" w:beforeAutospacing="0" w:line="240" w:lineRule="auto"/>
+        <w:spacing w:after="28" w:afterAutospacing="0" w:before="0" w:beforeAutospacing="0" w:line="240" w:lineRule="auto"/>
         <w:ind/>
         <w:jc w:val="center"/>
         <w:rPr>
@@ -254,11 +254,10 @@
       </w:r>
       <w:r>
         <w:rPr>
-          <w:rFonts w:ascii="Times New Roman" w:hAnsi="Times New Roman" w:eastAsia="Times New Roman" w:cs="Times New Roman"/>
+          <w:rFonts w:ascii="Times New Roman" w:hAnsi="Times New Roman" w:cs="Times New Roman"/>
           <w:b w:val="0"/>
           <w:bCs w:val="0"/>
           <w:i w:val="0"/>
-          <w:iCs w:val="0"/>
           <w:sz w:val="24"/>
           <w:szCs w:val="24"/>
         </w:rPr>
@@ -268,7 +267,7 @@
       <w:pPr>
         <w:pStyle w:val="906"/>
         <w:pBdr/>
-        <w:spacing w:after="0" w:afterAutospacing="0" w:before="0" w:beforeAutospacing="0" w:line="240" w:lineRule="auto"/>
+        <w:spacing w:after="28" w:afterAutospacing="0" w:before="0" w:beforeAutospacing="0" w:line="240" w:lineRule="auto"/>
         <w:ind/>
         <w:contextualSpacing w:val="true"/>
         <w:rPr>
@@ -294,7 +293,7 @@
       </w:r>
       <w:r>
         <w:rPr>
-          <w:rFonts w:ascii="Times New Roman" w:hAnsi="Times New Roman" w:eastAsia="Times New Roman" w:cs="Times New Roman"/>
+          <w:rFonts w:ascii="Times New Roman" w:hAnsi="Times New Roman" w:cs="Times New Roman"/>
           <w:sz w:val="24"/>
           <w:szCs w:val="24"/>
         </w:rPr>
@@ -304,7 +303,7 @@
       <w:pPr>
         <w:pStyle w:val="906"/>
         <w:pBdr/>
-        <w:spacing w:after="0" w:afterAutospacing="0" w:before="0" w:beforeAutospacing="0" w:line="240" w:lineRule="auto"/>
+        <w:spacing w:after="28" w:afterAutospacing="0" w:before="0" w:beforeAutospacing="0" w:line="240" w:lineRule="auto"/>
         <w:ind/>
         <w:contextualSpacing w:val="true"/>
         <w:rPr>
@@ -333,7 +332,7 @@
       </w:r>
       <w:r>
         <w:rPr>
-          <w:rFonts w:ascii="Times New Roman" w:hAnsi="Times New Roman" w:eastAsia="Times New Roman" w:cs="Times New Roman"/>
+          <w:rFonts w:ascii="Times New Roman" w:hAnsi="Times New Roman" w:cs="Times New Roman"/>
           <w:b w:val="0"/>
           <w:sz w:val="24"/>
           <w:szCs w:val="24"/>
@@ -344,7 +343,7 @@
       <w:pPr>
         <w:pStyle w:val="921"/>
         <w:pBdr/>
-        <w:spacing w:after="0" w:afterAutospacing="0" w:before="0" w:beforeAutospacing="0" w:line="240" w:lineRule="auto"/>
+        <w:spacing w:after="28" w:afterAutospacing="0" w:before="0" w:beforeAutospacing="0" w:line="240" w:lineRule="auto"/>
         <w:ind/>
         <w:jc w:val="center"/>
         <w:rPr>
@@ -372,10 +371,9 @@
       </w:r>
       <w:r>
         <w:rPr>
-          <w:rFonts w:ascii="Times New Roman" w:hAnsi="Times New Roman" w:eastAsia="Times New Roman" w:cs="Times New Roman"/>
+          <w:rFonts w:ascii="Times New Roman" w:hAnsi="Times New Roman" w:cs="Times New Roman"/>
           <w:sz w:val="24"/>
           <w:szCs w:val="24"/>
-          <w:lang w:eastAsia="en-US"/>
         </w:rPr>
       </w:r>
     </w:p>
@@ -387,7 +385,7 @@
           <w:tab w:val="center" w:leader="none" w:pos="4678"/>
           <w:tab w:val="right" w:leader="none" w:pos="9356"/>
         </w:tabs>
-        <w:spacing w:after="0" w:afterAutospacing="0" w:before="0" w:beforeAutospacing="0" w:line="240" w:lineRule="auto"/>
+        <w:spacing w:after="28" w:afterAutospacing="0" w:before="0" w:beforeAutospacing="0" w:line="240" w:lineRule="auto"/>
         <w:ind/>
         <w:contextualSpacing w:val="true"/>
         <w:jc w:val="center"/>
@@ -434,7 +432,7 @@
       </w:r>
       <w:r>
         <w:rPr>
-          <w:rFonts w:ascii="Times New Roman" w:hAnsi="Times New Roman" w:eastAsia="Times New Roman" w:cs="Times New Roman"/>
+          <w:rFonts w:ascii="Times New Roman" w:hAnsi="Times New Roman" w:cs="Times New Roman"/>
           <w:bCs/>
           <w:color w:val="000000" w:themeColor="text1"/>
           <w:sz w:val="24"/>
@@ -447,7 +445,7 @@
       <w:pPr>
         <w:pStyle w:val="921"/>
         <w:pBdr/>
-        <w:spacing w:after="0" w:afterAutospacing="0" w:before="0" w:beforeAutospacing="0" w:line="240" w:lineRule="auto"/>
+        <w:spacing w:after="28" w:afterAutospacing="0" w:before="0" w:beforeAutospacing="0" w:line="240" w:lineRule="auto"/>
         <w:ind/>
         <w:jc w:val="center"/>
         <w:rPr>
@@ -481,7 +479,7 @@
       </w:r>
       <w:r>
         <w:rPr>
-          <w:rFonts w:ascii="Times New Roman" w:hAnsi="Times New Roman" w:eastAsia="Times New Roman" w:cs="Times New Roman"/>
+          <w:rFonts w:ascii="Times New Roman" w:hAnsi="Times New Roman" w:cs="Times New Roman"/>
           <w:b/>
           <w:bCs/>
           <w:color w:val="000000" w:themeColor="text1"/>
@@ -494,7 +492,7 @@
       <w:pPr>
         <w:pStyle w:val="921"/>
         <w:pBdr/>
-        <w:spacing w:after="0" w:afterAutospacing="0" w:before="0" w:beforeAutospacing="0" w:line="240" w:lineRule="auto"/>
+        <w:spacing w:after="28" w:afterAutospacing="0" w:before="0" w:beforeAutospacing="0" w:line="240" w:lineRule="auto"/>
         <w:ind/>
         <w:contextualSpacing w:val="true"/>
         <w:jc w:val="center"/>
@@ -502,6 +500,7 @@
           <w:rFonts w:ascii="Times New Roman" w:hAnsi="Times New Roman" w:cs="Times New Roman"/>
           <w:b/>
           <w:bCs/>
+          <w:color w:val="000000" w:themeColor="text1"/>
           <w:sz w:val="24"/>
           <w:szCs w:val="24"/>
         </w:rPr>
@@ -510,6 +509,7 @@
         <w:rPr>
           <w:rFonts w:ascii="Times New Roman" w:hAnsi="Times New Roman" w:eastAsia="Times New Roman" w:cs="Times New Roman"/>
           <w:b/>
+          <w:color w:val="000000" w:themeColor="text1"/>
           <w:sz w:val="24"/>
           <w:szCs w:val="24"/>
         </w:rPr>
@@ -519,6 +519,7 @@
         <w:rPr>
           <w:rFonts w:ascii="Times New Roman" w:hAnsi="Times New Roman" w:eastAsia="Times New Roman" w:cs="Times New Roman"/>
           <w:b/>
+          <w:color w:val="000000" w:themeColor="text1"/>
           <w:sz w:val="24"/>
           <w:szCs w:val="24"/>
         </w:rPr>
@@ -529,6 +530,7 @@
           <w:rFonts w:ascii="Times New Roman" w:hAnsi="Times New Roman" w:eastAsia="Times New Roman" w:cs="Times New Roman"/>
           <w:b/>
           <w:bCs/>
+          <w:color w:val="000000" w:themeColor="text1"/>
           <w:sz w:val="24"/>
           <w:szCs w:val="24"/>
         </w:rPr>
@@ -539,6 +541,7 @@
           <w:rFonts w:ascii="Times New Roman" w:hAnsi="Times New Roman" w:eastAsia="Times New Roman" w:cs="Times New Roman"/>
           <w:b/>
           <w:bCs/>
+          <w:color w:val="000000" w:themeColor="text1"/>
           <w:sz w:val="24"/>
           <w:szCs w:val="24"/>
         </w:rPr>
@@ -549,6 +552,7 @@
           <w:rFonts w:ascii="Times New Roman" w:hAnsi="Times New Roman" w:eastAsia="Times New Roman" w:cs="Times New Roman"/>
           <w:b/>
           <w:bCs/>
+          <w:color w:val="000000" w:themeColor="text1"/>
           <w:sz w:val="24"/>
           <w:szCs w:val="24"/>
         </w:rPr>
@@ -559,7 +563,7 @@
           <w:rFonts w:ascii="Times New Roman" w:hAnsi="Times New Roman" w:eastAsia="Times New Roman" w:cs="Times New Roman"/>
           <w:b/>
           <w:bCs/>
-          <w:color w:val="ff0000"/>
+          <w:color w:val="000000" w:themeColor="text1"/>
           <w:sz w:val="24"/>
           <w:szCs w:val="24"/>
         </w:rPr>
@@ -570,7 +574,7 @@
           <w:rFonts w:ascii="Times New Roman" w:hAnsi="Times New Roman" w:eastAsia="Times New Roman" w:cs="Times New Roman"/>
           <w:b/>
           <w:bCs/>
-          <w:color w:val="ff0000"/>
+          <w:color w:val="000000" w:themeColor="text1"/>
           <w:sz w:val="24"/>
           <w:szCs w:val="24"/>
         </w:rPr>
@@ -581,7 +585,7 @@
           <w:rFonts w:ascii="Times New Roman" w:hAnsi="Times New Roman" w:eastAsia="Times New Roman" w:cs="Times New Roman"/>
           <w:b/>
           <w:bCs/>
-          <w:color w:val="ff0000"/>
+          <w:color w:val="000000" w:themeColor="text1"/>
           <w:sz w:val="24"/>
           <w:szCs w:val="24"/>
         </w:rPr>
@@ -592,7 +596,7 @@
           <w:rFonts w:ascii="Times New Roman" w:hAnsi="Times New Roman" w:eastAsia="Times New Roman" w:cs="Times New Roman"/>
           <w:b/>
           <w:bCs/>
-          <w:color w:val="ff0000"/>
+          <w:color w:val="000000" w:themeColor="text1"/>
           <w:sz w:val="24"/>
           <w:szCs w:val="24"/>
         </w:rPr>
@@ -603,7 +607,7 @@
           <w:rFonts w:ascii="Times New Roman" w:hAnsi="Times New Roman" w:eastAsia="Times New Roman" w:cs="Times New Roman"/>
           <w:b/>
           <w:bCs/>
-          <w:color w:val="ff0000"/>
+          <w:color w:val="000000" w:themeColor="text1"/>
           <w:sz w:val="24"/>
           <w:szCs w:val="24"/>
         </w:rPr>
@@ -614,7 +618,7 @@
           <w:rFonts w:ascii="Times New Roman" w:hAnsi="Times New Roman" w:eastAsia="Times New Roman" w:cs="Times New Roman"/>
           <w:b/>
           <w:bCs/>
-          <w:color w:val="ff0000"/>
+          <w:color w:val="000000" w:themeColor="text1"/>
           <w:sz w:val="24"/>
           <w:szCs w:val="24"/>
         </w:rPr>
@@ -625,7 +629,7 @@
           <w:rFonts w:ascii="Times New Roman" w:hAnsi="Times New Roman" w:eastAsia="Times New Roman" w:cs="Times New Roman"/>
           <w:b/>
           <w:bCs/>
-          <w:color w:val="ff0000"/>
+          <w:color w:val="000000" w:themeColor="text1"/>
           <w:sz w:val="24"/>
           <w:szCs w:val="24"/>
         </w:rPr>
@@ -636,7 +640,7 @@
           <w:rFonts w:ascii="Times New Roman" w:hAnsi="Times New Roman" w:eastAsia="Times New Roman" w:cs="Times New Roman"/>
           <w:b/>
           <w:bCs/>
-          <w:color w:val="ff0000"/>
+          <w:color w:val="000000" w:themeColor="text1"/>
           <w:sz w:val="24"/>
           <w:szCs w:val="24"/>
         </w:rPr>
@@ -647,15 +651,17 @@
           <w:rFonts w:ascii="Times New Roman" w:hAnsi="Times New Roman" w:eastAsia="Times New Roman" w:cs="Times New Roman"/>
           <w:b/>
           <w:bCs/>
+          <w:color w:val="000000" w:themeColor="text1"/>
           <w:sz w:val="24"/>
           <w:szCs w:val="24"/>
         </w:rPr>
       </w:r>
       <w:r>
         <w:rPr>
-          <w:rFonts w:ascii="Times New Roman" w:hAnsi="Times New Roman" w:eastAsia="Times New Roman" w:cs="Times New Roman"/>
+          <w:rFonts w:ascii="Times New Roman" w:hAnsi="Times New Roman" w:cs="Times New Roman"/>
           <w:b/>
           <w:bCs/>
+          <w:color w:val="000000" w:themeColor="text1"/>
           <w:sz w:val="24"/>
           <w:szCs w:val="24"/>
         </w:rPr>
@@ -665,7 +671,7 @@
       <w:pPr>
         <w:pStyle w:val="921"/>
         <w:pBdr/>
-        <w:spacing w:after="0" w:afterAutospacing="0" w:before="0" w:beforeAutospacing="0" w:line="240" w:lineRule="auto"/>
+        <w:spacing w:after="28" w:afterAutospacing="0" w:before="0" w:beforeAutospacing="0" w:line="240" w:lineRule="auto"/>
         <w:ind/>
         <w:jc w:val="both"/>
         <w:rPr>
@@ -697,7 +703,7 @@
       </w:r>
       <w:r>
         <w:rPr>
-          <w:rFonts w:ascii="Times New Roman" w:hAnsi="Times New Roman" w:eastAsia="Times New Roman" w:cs="Times New Roman"/>
+          <w:rFonts w:ascii="Times New Roman" w:hAnsi="Times New Roman" w:cs="Times New Roman"/>
           <w:b/>
           <w:bCs/>
           <w:sz w:val="24"/>
@@ -709,8 +715,8 @@
       <w:pPr>
         <w:pStyle w:val="921"/>
         <w:pBdr/>
-        <w:spacing w:after="0" w:afterAutospacing="0" w:before="0" w:beforeAutospacing="0" w:line="240" w:lineRule="auto"/>
-        <w:ind w:left="708"/>
+        <w:spacing w:after="28" w:afterAutospacing="0" w:before="0" w:beforeAutospacing="0" w:line="240" w:lineRule="auto"/>
+        <w:ind w:left="0"/>
         <w:jc w:val="both"/>
         <w:rPr>
           <w:rFonts w:ascii="Times New Roman" w:hAnsi="Times New Roman" w:cs="Times New Roman"/>
@@ -719,16 +725,6 @@
           <w:szCs w:val="24"/>
         </w:rPr>
       </w:pPr>
-      <w:r>
-        <w:rPr>
-          <w:rFonts w:ascii="Times New Roman" w:hAnsi="Times New Roman" w:eastAsia="Times New Roman" w:cs="Times New Roman"/>
-          <w:bCs/>
-          <w:color w:val="000000" w:themeColor="text1"/>
-          <w:sz w:val="24"/>
-          <w:szCs w:val="24"/>
-        </w:rPr>
-        <w:t xml:space="preserve">    </w:t>
-      </w:r>
       <w:r>
         <w:rPr>
           <w:rFonts w:ascii="Times New Roman" w:hAnsi="Times New Roman" w:eastAsia="Times New Roman" w:cs="Times New Roman"/>
@@ -1678,7 +1674,7 @@
       </w:r>
       <w:r>
         <w:rPr>
-          <w:rFonts w:ascii="Times New Roman" w:hAnsi="Times New Roman" w:eastAsia="Times New Roman" w:cs="Times New Roman"/>
+          <w:rFonts w:ascii="Times New Roman" w:hAnsi="Times New Roman" w:cs="Times New Roman"/>
           <w:color w:val="000000" w:themeColor="text1"/>
           <w:sz w:val="24"/>
           <w:szCs w:val="24"/>
@@ -1689,7 +1685,7 @@
       <w:pPr>
         <w:pStyle w:val="921"/>
         <w:pBdr/>
-        <w:spacing w:after="0" w:afterAutospacing="0" w:before="0" w:beforeAutospacing="0" w:line="240" w:lineRule="auto"/>
+        <w:spacing w:after="28" w:afterAutospacing="0" w:before="0" w:beforeAutospacing="0" w:line="240" w:lineRule="auto"/>
         <w:ind/>
         <w:jc w:val="right"/>
         <w:rPr>
@@ -1773,7 +1769,7 @@
       </w:r>
       <w:r>
         <w:rPr>
-          <w:rFonts w:ascii="Times New Roman" w:hAnsi="Times New Roman" w:eastAsia="Times New Roman" w:cs="Times New Roman"/>
+          <w:rFonts w:ascii="Times New Roman" w:hAnsi="Times New Roman" w:cs="Times New Roman"/>
           <w:bCs/>
           <w:color w:val="ff0000"/>
           <w:sz w:val="24"/>
@@ -1785,7 +1781,7 @@
       <w:pPr>
         <w:pStyle w:val="921"/>
         <w:pBdr/>
-        <w:spacing w:after="0" w:afterAutospacing="0" w:before="0" w:beforeAutospacing="0" w:line="240" w:lineRule="auto"/>
+        <w:spacing w:after="28" w:afterAutospacing="0" w:before="0" w:beforeAutospacing="0" w:line="240" w:lineRule="auto"/>
         <w:ind/>
         <w:jc w:val="center"/>
         <w:rPr>
@@ -1810,7 +1806,7 @@
       </w:r>
       <w:r>
         <w:rPr>
-          <w:rFonts w:ascii="Times New Roman" w:hAnsi="Times New Roman" w:eastAsia="Times New Roman" w:cs="Times New Roman"/>
+          <w:rFonts w:ascii="Times New Roman" w:hAnsi="Times New Roman" w:cs="Times New Roman"/>
           <w:sz w:val="24"/>
           <w:szCs w:val="24"/>
         </w:rPr>
@@ -1820,7 +1816,7 @@
       <w:pPr>
         <w:pStyle w:val="921"/>
         <w:pBdr/>
-        <w:spacing w:after="0" w:afterAutospacing="0" w:before="0" w:beforeAutospacing="0" w:line="240" w:lineRule="auto"/>
+        <w:spacing w:after="28" w:afterAutospacing="0" w:before="0" w:beforeAutospacing="0" w:line="240" w:lineRule="auto"/>
         <w:ind/>
         <w:jc w:val="center"/>
         <w:rPr>
@@ -1846,7 +1842,7 @@
       </w:r>
       <w:r>
         <w:rPr>
-          <w:rFonts w:ascii="Times New Roman" w:hAnsi="Times New Roman" w:eastAsia="Times New Roman" w:cs="Times New Roman"/>
+          <w:rFonts w:ascii="Times New Roman" w:hAnsi="Times New Roman" w:cs="Times New Roman"/>
           <w:sz w:val="24"/>
           <w:szCs w:val="24"/>
         </w:rPr>
@@ -1856,7 +1852,7 @@
       <w:pPr>
         <w:pStyle w:val="921"/>
         <w:pBdr/>
-        <w:spacing w:after="0" w:afterAutospacing="0" w:before="0" w:beforeAutospacing="0" w:line="240" w:lineRule="auto"/>
+        <w:spacing w:after="28" w:afterAutospacing="0" w:before="0" w:beforeAutospacing="0" w:line="240" w:lineRule="auto"/>
         <w:ind/>
         <w:jc w:val="center"/>
         <w:rPr>
@@ -1889,7 +1885,7 @@
       </w:r>
       <w:r>
         <w:rPr>
-          <w:rFonts w:ascii="Times New Roman" w:hAnsi="Times New Roman" w:eastAsia="Times New Roman" w:cs="Times New Roman"/>
+          <w:rFonts w:ascii="Times New Roman" w:hAnsi="Times New Roman" w:cs="Times New Roman"/>
           <w:sz w:val="24"/>
           <w:szCs w:val="24"/>
         </w:rPr>
@@ -1899,7 +1895,7 @@
       <w:pPr>
         <w:pStyle w:val="921"/>
         <w:pBdr/>
-        <w:spacing w:after="0" w:afterAutospacing="0" w:before="0" w:beforeAutospacing="0" w:line="240" w:lineRule="auto"/>
+        <w:spacing w:after="28" w:afterAutospacing="0" w:before="0" w:beforeAutospacing="0" w:line="240" w:lineRule="auto"/>
         <w:ind/>
         <w:jc w:val="center"/>
         <w:rPr>
@@ -1928,7 +1924,7 @@
       </w:r>
       <w:r>
         <w:rPr>
-          <w:rFonts w:ascii="Times New Roman" w:hAnsi="Times New Roman" w:eastAsia="Times New Roman" w:cs="Times New Roman"/>
+          <w:rFonts w:ascii="Times New Roman" w:hAnsi="Times New Roman" w:cs="Times New Roman"/>
           <w:color w:val="000000" w:themeColor="text1"/>
           <w:sz w:val="24"/>
           <w:szCs w:val="24"/>
@@ -1939,16 +1935,15 @@
       <w:pPr>
         <w:pStyle w:val="921"/>
         <w:pBdr/>
-        <w:spacing w:after="0" w:afterAutospacing="0" w:before="0" w:beforeAutospacing="0" w:line="240" w:lineRule="auto"/>
+        <w:spacing w:after="28" w:afterAutospacing="0" w:before="0" w:beforeAutospacing="0" w:line="240" w:lineRule="auto"/>
         <w:ind/>
         <w:jc w:val="center"/>
         <w:rPr>
-          <w:rFonts w:ascii="Times New Roman" w:hAnsi="Times New Roman" w:cs="Times New Roman"/>
-          <w:b/>
-          <w:bCs/>
+          <w:rFonts w:ascii="Times New Roman" w:hAnsi="Times New Roman" w:eastAsia="Times New Roman" w:cs="Times New Roman"/>
           <w:color w:val="000000" w:themeColor="text1"/>
           <w:sz w:val="24"/>
           <w:szCs w:val="24"/>
+          <w:highlight w:val="none"/>
         </w:rPr>
       </w:pPr>
       <w:r>
@@ -1989,17 +1984,7 @@
       </w:r>
       <w:r>
         <w:rPr>
-          <w:rFonts w:ascii="Times New Roman" w:hAnsi="Times New Roman" w:eastAsia="Times New Roman" w:cs="Times New Roman"/>
-          <w:b/>
-          <w:bCs/>
-          <w:color w:val="000000" w:themeColor="text1"/>
-          <w:sz w:val="24"/>
-          <w:szCs w:val="24"/>
-        </w:rPr>
-      </w:r>
-      <w:r>
-        <w:rPr>
-          <w:rFonts w:ascii="Times New Roman" w:hAnsi="Times New Roman" w:eastAsia="Times New Roman" w:cs="Times New Roman"/>
+          <w:rFonts w:ascii="Times New Roman" w:hAnsi="Times New Roman" w:cs="Times New Roman"/>
           <w:b/>
           <w:bCs/>
           <w:color w:val="000000" w:themeColor="text1"/>
@@ -2012,13 +1997,14 @@
       <w:pPr>
         <w:pStyle w:val="921"/>
         <w:pBdr/>
-        <w:spacing w:after="0" w:afterAutospacing="0" w:before="0" w:beforeAutospacing="0" w:line="240" w:lineRule="auto"/>
+        <w:spacing w:after="28" w:afterAutospacing="0" w:afterLines="0" w:before="0" w:beforeAutospacing="0" w:line="240" w:lineRule="auto"/>
         <w:ind/>
         <w:jc w:val="center"/>
         <w:rPr>
           <w:rFonts w:ascii="Times New Roman" w:hAnsi="Times New Roman" w:cs="Times New Roman"/>
           <w:b/>
           <w:bCs/>
+          <w:color w:val="000000" w:themeColor="text1"/>
           <w:sz w:val="24"/>
           <w:szCs w:val="24"/>
         </w:rPr>
@@ -2026,35 +2012,35 @@
       <w:r>
         <w:rPr>
           <w:rFonts w:ascii="Times New Roman" w:hAnsi="Times New Roman" w:eastAsia="Times New Roman" w:cs="Times New Roman"/>
-          <w:b/>
-          <w:bCs/>
+          <w:color w:val="000000" w:themeColor="text1"/>
           <w:sz w:val="24"/>
           <w:szCs w:val="24"/>
+          <w:highlight w:val="none"/>
         </w:rPr>
       </w:r>
       <w:r>
         <w:rPr>
           <w:rFonts w:ascii="Times New Roman" w:hAnsi="Times New Roman" w:eastAsia="Times New Roman" w:cs="Times New Roman"/>
-          <w:b/>
-          <w:bCs/>
+          <w:color w:val="000000" w:themeColor="text1"/>
           <w:sz w:val="24"/>
           <w:szCs w:val="24"/>
+          <w:highlight w:val="none"/>
         </w:rPr>
       </w:r>
       <w:r>
         <w:rPr>
           <w:rFonts w:ascii="Times New Roman" w:hAnsi="Times New Roman" w:eastAsia="Times New Roman" w:cs="Times New Roman"/>
-          <w:b/>
-          <w:bCs/>
+          <w:color w:val="000000" w:themeColor="text1"/>
           <w:sz w:val="24"/>
           <w:szCs w:val="24"/>
+          <w:highlight w:val="none"/>
         </w:rPr>
       </w:r>
     </w:p>
     <w:p>
       <w:pPr>
         <w:pBdr/>
-        <w:spacing w:after="0" w:afterAutospacing="0" w:before="0" w:beforeAutospacing="0" w:line="240" w:lineRule="auto"/>
+        <w:spacing w:after="28" w:afterAutospacing="0" w:before="0" w:beforeAutospacing="0" w:line="240" w:lineRule="auto"/>
         <w:ind/>
         <w:jc w:val="center"/>
         <w:rPr>
@@ -2083,7 +2069,7 @@
       </w:r>
       <w:r>
         <w:rPr>
-          <w:rFonts w:ascii="Times New Roman" w:hAnsi="Times New Roman" w:eastAsia="Times New Roman" w:cs="Times New Roman"/>
+          <w:rFonts w:ascii="Times New Roman" w:hAnsi="Times New Roman" w:cs="Times New Roman"/>
           <w:b/>
           <w:sz w:val="24"/>
           <w:szCs w:val="24"/>
@@ -2094,7 +2080,7 @@
       <w:pPr>
         <w:pStyle w:val="921"/>
         <w:pBdr/>
-        <w:spacing w:after="0" w:afterAutospacing="0" w:before="0" w:beforeAutospacing="0" w:line="240" w:lineRule="auto"/>
+        <w:spacing w:after="28" w:afterAutospacing="0" w:before="0" w:beforeAutospacing="0" w:line="240" w:lineRule="auto"/>
         <w:ind/>
         <w:jc w:val="both"/>
         <w:rPr>
@@ -2233,12 +2219,20 @@
           <w:szCs w:val="24"/>
         </w:rPr>
       </w:r>
+      <w:r>
+        <w:rPr>
+          <w:rFonts w:ascii="Times New Roman" w:hAnsi="Times New Roman" w:cs="Times New Roman"/>
+          <w:color w:val="000000" w:themeColor="text1"/>
+          <w:sz w:val="24"/>
+          <w:szCs w:val="24"/>
+        </w:rPr>
+      </w:r>
     </w:p>
     <w:p>
       <w:pPr>
         <w:pStyle w:val="921"/>
         <w:pBdr/>
-        <w:spacing w:after="0" w:afterAutospacing="0" w:before="0" w:beforeAutospacing="0" w:line="240" w:lineRule="auto"/>
+        <w:spacing w:after="28" w:afterAutospacing="0" w:before="0" w:beforeAutospacing="0" w:line="240" w:lineRule="auto"/>
         <w:ind/>
         <w:jc w:val="both"/>
         <w:rPr>
@@ -2261,12 +2255,19 @@
           <w:szCs w:val="24"/>
         </w:rPr>
       </w:r>
+      <w:r>
+        <w:rPr>
+          <w:rFonts w:ascii="Times New Roman" w:hAnsi="Times New Roman" w:cs="Times New Roman"/>
+          <w:sz w:val="24"/>
+          <w:szCs w:val="24"/>
+        </w:rPr>
+      </w:r>
     </w:p>
     <w:p>
       <w:pPr>
         <w:pStyle w:val="921"/>
         <w:pBdr/>
-        <w:spacing w:after="0" w:afterAutospacing="0" w:before="0" w:beforeAutospacing="0" w:line="240" w:lineRule="auto"/>
+        <w:spacing w:after="28" w:afterAutospacing="0" w:before="0" w:beforeAutospacing="0" w:line="240" w:lineRule="auto"/>
         <w:ind/>
         <w:jc w:val="right"/>
         <w:rPr>
@@ -2340,7 +2341,7 @@
       </w:r>
       <w:r>
         <w:rPr>
-          <w:rFonts w:ascii="Times New Roman" w:hAnsi="Times New Roman" w:eastAsia="Times New Roman" w:cs="Times New Roman"/>
+          <w:rFonts w:ascii="Times New Roman" w:hAnsi="Times New Roman" w:cs="Times New Roman"/>
           <w:bCs/>
           <w:sz w:val="24"/>
           <w:szCs w:val="24"/>
@@ -2348,30 +2349,7 @@
       </w:r>
       <w:r>
         <w:rPr>
-          <w:rFonts w:ascii="Times New Roman" w:hAnsi="Times New Roman" w:cs="Times New Roman"/>
-          <w:bCs/>
-          <w:sz w:val="24"/>
-          <w:szCs w:val="24"/>
-        </w:rPr>
-      </w:r>
-    </w:p>
-    <w:p>
-      <w:pPr>
-        <w:pStyle w:val="921"/>
-        <w:pBdr/>
-        <w:spacing w:after="0" w:afterAutospacing="0" w:afterLines="0" w:before="0" w:beforeAutospacing="0" w:beforeLines="0" w:line="240" w:lineRule="auto"/>
-        <w:ind/>
-        <w:jc w:val="right"/>
-        <w:rPr>
-          <w:rFonts w:ascii="Times New Roman" w:hAnsi="Times New Roman" w:cs="Times New Roman"/>
-          <w:sz w:val="24"/>
-          <w:szCs w:val="24"/>
-        </w:rPr>
-      </w:pPr>
-      <w:r>
-        <w:rPr>
           <w:rFonts w:ascii="Times New Roman" w:hAnsi="Times New Roman" w:eastAsia="Times New Roman" w:cs="Times New Roman"/>
-          <w:bCs/>
           <w:sz w:val="24"/>
           <w:szCs w:val="24"/>
           <w:highlight w:val="none"/>
@@ -2395,12 +2373,27 @@
           <w:highlight w:val="none"/>
         </w:rPr>
       </w:r>
+      <w:r>
+        <w:rPr>
+          <w:rFonts w:ascii="Times New Roman" w:hAnsi="Times New Roman" w:cs="Times New Roman"/>
+          <w:sz w:val="24"/>
+          <w:szCs w:val="24"/>
+        </w:rPr>
+      </w:r>
+      <w:r>
+        <w:rPr>
+          <w:rFonts w:ascii="Times New Roman" w:hAnsi="Times New Roman" w:eastAsia="Times New Roman" w:cs="Times New Roman"/>
+          <w:sz w:val="24"/>
+          <w:szCs w:val="24"/>
+          <w:highlight w:val="none"/>
+        </w:rPr>
+      </w:r>
     </w:p>
     <w:p>
       <w:pPr>
         <w:pStyle w:val="921"/>
         <w:pBdr/>
-        <w:spacing w:after="0" w:afterAutospacing="0" w:before="0" w:beforeAutospacing="0" w:line="240" w:lineRule="auto"/>
+        <w:spacing w:after="28" w:afterAutospacing="0" w:before="0" w:beforeAutospacing="0" w:line="240" w:lineRule="auto"/>
         <w:ind/>
         <w:jc w:val="center"/>
         <w:rPr>
@@ -2432,7 +2425,7 @@
       </w:r>
       <w:r>
         <w:rPr>
-          <w:rFonts w:ascii="Times New Roman" w:hAnsi="Times New Roman" w:eastAsia="Times New Roman" w:cs="Times New Roman"/>
+          <w:rFonts w:ascii="Times New Roman" w:hAnsi="Times New Roman" w:cs="Times New Roman"/>
           <w:bCs/>
           <w:color w:val="000000" w:themeColor="text1"/>
           <w:sz w:val="24"/>
@@ -2444,7 +2437,7 @@
       <w:pPr>
         <w:pStyle w:val="921"/>
         <w:pBdr/>
-        <w:spacing w:after="0" w:afterAutospacing="0" w:before="0" w:beforeAutospacing="0" w:line="240" w:lineRule="auto"/>
+        <w:spacing w:after="28" w:afterAutospacing="0" w:before="0" w:beforeAutospacing="0" w:line="240" w:lineRule="auto"/>
         <w:ind/>
         <w:jc w:val="center"/>
         <w:rPr>
@@ -2474,7 +2467,7 @@
       </w:r>
       <w:r>
         <w:rPr>
-          <w:rFonts w:ascii="Times New Roman" w:hAnsi="Times New Roman" w:eastAsia="Times New Roman" w:cs="Times New Roman"/>
+          <w:rFonts w:ascii="Times New Roman" w:hAnsi="Times New Roman" w:cs="Times New Roman"/>
           <w:color w:val="000000" w:themeColor="text1"/>
           <w:sz w:val="24"/>
           <w:szCs w:val="24"/>
@@ -2488,7 +2481,7 @@
         <w:tabs>
           <w:tab w:val="left" w:leader="none" w:pos="2127"/>
         </w:tabs>
-        <w:spacing w:after="0" w:afterAutospacing="0" w:before="0" w:beforeAutospacing="0" w:line="240" w:lineRule="auto"/>
+        <w:spacing w:after="28" w:afterAutospacing="0" w:before="0" w:beforeAutospacing="0" w:line="240" w:lineRule="auto"/>
         <w:ind/>
         <w:contextualSpacing w:val="true"/>
         <w:jc w:val="center"/>
@@ -2515,11 +2508,12 @@
           <w:color w:val="000000" w:themeColor="text1"/>
           <w:sz w:val="24"/>
           <w:szCs w:val="24"/>
+          <w:highlight w:val="none"/>
         </w:rPr>
       </w:r>
       <w:r>
         <w:rPr>
-          <w:rFonts w:ascii="Times New Roman" w:hAnsi="Times New Roman" w:eastAsia="Times New Roman" w:cs="Times New Roman"/>
+          <w:rFonts w:ascii="Times New Roman" w:hAnsi="Times New Roman" w:cs="Times New Roman"/>
           <w:color w:val="000000" w:themeColor="text1"/>
           <w:sz w:val="24"/>
           <w:szCs w:val="24"/>
@@ -2534,7 +2528,7 @@
         <w:tabs>
           <w:tab w:val="left" w:leader="none" w:pos="2127"/>
         </w:tabs>
-        <w:spacing w:after="0" w:afterAutospacing="0" w:before="0" w:beforeAutospacing="0" w:line="240" w:lineRule="auto"/>
+        <w:spacing w:after="28" w:afterAutospacing="0" w:before="0" w:beforeAutospacing="0" w:line="240" w:lineRule="auto"/>
         <w:ind/>
         <w:contextualSpacing w:val="true"/>
         <w:jc w:val="center"/>
@@ -2545,15 +2539,6 @@
           <w:szCs w:val="24"/>
         </w:rPr>
       </w:pPr>
-      <w:r>
-        <w:rPr>
-          <w:rFonts w:ascii="Times New Roman" w:hAnsi="Times New Roman" w:eastAsia="Times New Roman" w:cs="Times New Roman"/>
-          <w:color w:val="000000" w:themeColor="text1"/>
-          <w:sz w:val="24"/>
-          <w:szCs w:val="24"/>
-          <w:highlight w:val="none"/>
-        </w:rPr>
-      </w:r>
       <w:r>
         <w:rPr>
           <w:rFonts w:ascii="Times New Roman" w:hAnsi="Times New Roman" w:eastAsia="Times New Roman" w:cs="Times New Roman"/>
@@ -2571,12 +2556,20 @@
           <w:szCs w:val="24"/>
         </w:rPr>
       </w:r>
+      <w:r>
+        <w:rPr>
+          <w:rFonts w:ascii="Times New Roman" w:hAnsi="Times New Roman" w:cs="Times New Roman"/>
+          <w:color w:val="000000" w:themeColor="text1"/>
+          <w:sz w:val="24"/>
+          <w:szCs w:val="24"/>
+        </w:rPr>
+      </w:r>
     </w:p>
     <w:p>
       <w:pPr>
         <w:pStyle w:val="921"/>
         <w:pBdr/>
-        <w:spacing w:after="0" w:afterAutospacing="0" w:before="0" w:beforeAutospacing="0" w:line="240" w:lineRule="auto"/>
+        <w:spacing w:after="28" w:afterAutospacing="0" w:before="0" w:beforeAutospacing="0" w:line="240" w:lineRule="auto"/>
         <w:ind/>
         <w:jc w:val="center"/>
         <w:rPr>
@@ -2608,7 +2601,7 @@
       </w:r>
       <w:r>
         <w:rPr>
-          <w:rFonts w:ascii="Times New Roman" w:hAnsi="Times New Roman" w:eastAsia="Times New Roman" w:cs="Times New Roman"/>
+          <w:rFonts w:ascii="Times New Roman" w:hAnsi="Times New Roman" w:cs="Times New Roman"/>
           <w:bCs/>
           <w:color w:val="000000" w:themeColor="text1"/>
           <w:sz w:val="24"/>
@@ -2620,7 +2613,7 @@
       <w:pPr>
         <w:pStyle w:val="921"/>
         <w:pBdr/>
-        <w:spacing w:after="0" w:afterAutospacing="0" w:before="0" w:beforeAutospacing="0" w:line="240" w:lineRule="auto"/>
+        <w:spacing w:after="28" w:afterAutospacing="0" w:before="0" w:beforeAutospacing="0" w:line="240" w:lineRule="auto"/>
         <w:ind/>
         <w:jc w:val="center"/>
         <w:rPr>
@@ -2651,7 +2644,7 @@
       </w:r>
       <w:r>
         <w:rPr>
-          <w:rFonts w:ascii="Times New Roman" w:hAnsi="Times New Roman" w:eastAsia="Times New Roman" w:cs="Times New Roman"/>
+          <w:rFonts w:ascii="Times New Roman" w:hAnsi="Times New Roman" w:cs="Times New Roman"/>
           <w:bCs/>
           <w:color w:val="000000" w:themeColor="text1"/>
           <w:sz w:val="24"/>
@@ -2663,7 +2656,7 @@
       <w:pPr>
         <w:pStyle w:val="921"/>
         <w:pBdr/>
-        <w:spacing w:after="0" w:afterAutospacing="0" w:before="0" w:beforeAutospacing="0" w:line="240" w:lineRule="auto"/>
+        <w:spacing w:after="28" w:afterAutospacing="0" w:before="0" w:beforeAutospacing="0" w:line="240" w:lineRule="auto"/>
         <w:ind/>
         <w:jc w:val="center"/>
         <w:rPr>
@@ -2689,11 +2682,12 @@
           <w:color w:val="000000" w:themeColor="text1"/>
           <w:sz w:val="24"/>
           <w:szCs w:val="24"/>
+          <w:highlight w:val="none"/>
         </w:rPr>
       </w:r>
       <w:r>
         <w:rPr>
-          <w:rFonts w:ascii="Times New Roman" w:hAnsi="Times New Roman" w:eastAsia="Times New Roman" w:cs="Times New Roman"/>
+          <w:rFonts w:ascii="Times New Roman" w:hAnsi="Times New Roman" w:cs="Times New Roman"/>
           <w:color w:val="000000" w:themeColor="text1"/>
           <w:sz w:val="24"/>
           <w:szCs w:val="24"/>
@@ -2705,7 +2699,7 @@
       <w:pPr>
         <w:pStyle w:val="921"/>
         <w:pBdr/>
-        <w:spacing w:after="0" w:afterAutospacing="0" w:before="0" w:beforeAutospacing="0" w:line="240" w:lineRule="auto"/>
+        <w:spacing w:after="28" w:afterAutospacing="0" w:before="0" w:beforeAutospacing="0" w:line="240" w:lineRule="auto"/>
         <w:ind/>
         <w:jc w:val="center"/>
         <w:rPr>
@@ -2715,15 +2709,6 @@
           <w:szCs w:val="24"/>
         </w:rPr>
       </w:pPr>
-      <w:r>
-        <w:rPr>
-          <w:rFonts w:ascii="Times New Roman" w:hAnsi="Times New Roman" w:eastAsia="Times New Roman" w:cs="Times New Roman"/>
-          <w:color w:val="000000" w:themeColor="text1"/>
-          <w:sz w:val="24"/>
-          <w:szCs w:val="24"/>
-          <w:highlight w:val="none"/>
-        </w:rPr>
-      </w:r>
       <w:r>
         <w:rPr>
           <w:rFonts w:ascii="Times New Roman" w:hAnsi="Times New Roman" w:eastAsia="Times New Roman" w:cs="Times New Roman"/>
@@ -2741,6 +2726,14 @@
           <w:szCs w:val="24"/>
         </w:rPr>
       </w:r>
+      <w:r>
+        <w:rPr>
+          <w:rFonts w:ascii="Times New Roman" w:hAnsi="Times New Roman" w:cs="Times New Roman"/>
+          <w:color w:val="000000" w:themeColor="text1"/>
+          <w:sz w:val="24"/>
+          <w:szCs w:val="24"/>
+        </w:rPr>
+      </w:r>
     </w:p>
     <w:p>
       <w:pPr>
@@ -2749,7 +2742,7 @@
         <w:tabs>
           <w:tab w:val="left" w:leader="none" w:pos="2635"/>
         </w:tabs>
-        <w:spacing w:after="0" w:afterAutospacing="0" w:before="0" w:beforeAutospacing="0" w:line="240" w:lineRule="auto"/>
+        <w:spacing w:after="28" w:afterAutospacing="0" w:before="0" w:beforeAutospacing="0" w:line="240" w:lineRule="auto"/>
         <w:ind/>
         <w:contextualSpacing w:val="true"/>
         <w:jc w:val="center"/>
@@ -2779,7 +2772,7 @@
       </w:r>
       <w:r>
         <w:rPr>
-          <w:rFonts w:ascii="Times New Roman" w:hAnsi="Times New Roman" w:eastAsia="Times New Roman" w:cs="Times New Roman"/>
+          <w:rFonts w:ascii="Times New Roman" w:hAnsi="Times New Roman" w:cs="Times New Roman"/>
           <w:color w:val="000000" w:themeColor="text1"/>
           <w:sz w:val="24"/>
           <w:szCs w:val="24"/>
@@ -2793,7 +2786,7 @@
         <w:tabs>
           <w:tab w:val="left" w:leader="none" w:pos="2127"/>
         </w:tabs>
-        <w:spacing w:after="0" w:afterAutospacing="0" w:before="0" w:beforeAutospacing="0" w:line="240" w:lineRule="auto"/>
+        <w:spacing w:after="28" w:afterAutospacing="0" w:before="0" w:beforeAutospacing="0" w:line="240" w:lineRule="auto"/>
         <w:ind/>
         <w:contextualSpacing w:val="true"/>
         <w:jc w:val="center"/>
@@ -2823,7 +2816,7 @@
       </w:r>
       <w:r>
         <w:rPr>
-          <w:rFonts w:ascii="Times New Roman" w:hAnsi="Times New Roman" w:eastAsia="Times New Roman" w:cs="Times New Roman"/>
+          <w:rFonts w:ascii="Times New Roman" w:hAnsi="Times New Roman" w:cs="Times New Roman"/>
           <w:color w:val="000000" w:themeColor="text1"/>
           <w:sz w:val="24"/>
           <w:szCs w:val="24"/>
@@ -2837,191 +2830,12 @@
         <w:tabs>
           <w:tab w:val="left" w:leader="none" w:pos="2127"/>
         </w:tabs>
-        <w:spacing w:after="0" w:afterAutospacing="0" w:before="0" w:beforeAutospacing="0" w:line="240" w:lineRule="auto"/>
+        <w:spacing w:after="28" w:afterAutospacing="0" w:before="0" w:beforeAutospacing="0" w:line="240" w:lineRule="auto"/>
         <w:ind/>
         <w:contextualSpacing w:val="true"/>
         <w:jc w:val="center"/>
         <w:rPr>
           <w:rFonts w:ascii="Times New Roman" w:hAnsi="Times New Roman" w:cs="Times New Roman"/>
-          <w:color w:val="000000" w:themeColor="text1"/>
-          <w:sz w:val="24"/>
-          <w:szCs w:val="24"/>
-          <w:highlight w:val="none"/>
-        </w:rPr>
-      </w:pPr>
-      <w:r>
-        <w:rPr>
-          <w:rFonts w:ascii="Times New Roman" w:hAnsi="Times New Roman" w:eastAsia="Times New Roman" w:cs="Times New Roman"/>
-          <w:color w:val="000000" w:themeColor="text1"/>
-          <w:sz w:val="24"/>
-          <w:szCs w:val="24"/>
-        </w:rPr>
-        <w:t xml:space="preserve">Testemunha</w:t>
-      </w:r>
-      <w:r>
-        <w:rPr>
-          <w:rFonts w:ascii="Times New Roman" w:hAnsi="Times New Roman" w:eastAsia="Times New Roman" w:cs="Times New Roman"/>
-          <w:color w:val="000000" w:themeColor="text1"/>
-          <w:sz w:val="24"/>
-          <w:szCs w:val="24"/>
-        </w:rPr>
-      </w:r>
-      <w:r>
-        <w:rPr>
-          <w:rFonts w:ascii="Times New Roman" w:hAnsi="Times New Roman" w:eastAsia="Times New Roman" w:cs="Times New Roman"/>
-          <w:color w:val="000000" w:themeColor="text1"/>
-          <w:sz w:val="24"/>
-          <w:szCs w:val="24"/>
-          <w:highlight w:val="none"/>
-        </w:rPr>
-      </w:r>
-    </w:p>
-    <w:p>
-      <w:pPr>
-        <w:pStyle w:val="924"/>
-        <w:pBdr/>
-        <w:tabs>
-          <w:tab w:val="left" w:leader="none" w:pos="2127"/>
-        </w:tabs>
-        <w:spacing w:after="0" w:afterAutospacing="0" w:before="0" w:beforeAutospacing="0" w:line="240" w:lineRule="auto"/>
-        <w:ind/>
-        <w:contextualSpacing w:val="true"/>
-        <w:jc w:val="center"/>
-        <w:rPr>
-          <w:rFonts w:ascii="Times New Roman" w:hAnsi="Times New Roman" w:cs="Times New Roman"/>
-          <w:color w:val="000000" w:themeColor="text1"/>
-          <w:sz w:val="24"/>
-          <w:szCs w:val="24"/>
-        </w:rPr>
-      </w:pPr>
-      <w:r>
-        <w:rPr>
-          <w:rFonts w:ascii="Times New Roman" w:hAnsi="Times New Roman" w:eastAsia="Times New Roman" w:cs="Times New Roman"/>
-          <w:color w:val="000000" w:themeColor="text1"/>
-          <w:sz w:val="24"/>
-          <w:szCs w:val="24"/>
-          <w:highlight w:val="none"/>
-        </w:rPr>
-      </w:r>
-      <w:r>
-        <w:rPr>
-          <w:rFonts w:ascii="Times New Roman" w:hAnsi="Times New Roman" w:eastAsia="Times New Roman" w:cs="Times New Roman"/>
-          <w:color w:val="000000" w:themeColor="text1"/>
-          <w:sz w:val="24"/>
-          <w:szCs w:val="24"/>
-          <w:highlight w:val="none"/>
-        </w:rPr>
-      </w:r>
-      <w:r>
-        <w:rPr>
-          <w:rFonts w:ascii="Times New Roman" w:hAnsi="Times New Roman" w:eastAsia="Times New Roman" w:cs="Times New Roman"/>
-          <w:color w:val="000000" w:themeColor="text1"/>
-          <w:sz w:val="24"/>
-          <w:szCs w:val="24"/>
-        </w:rPr>
-      </w:r>
-    </w:p>
-    <w:p>
-      <w:pPr>
-        <w:pStyle w:val="924"/>
-        <w:pBdr/>
-        <w:tabs>
-          <w:tab w:val="left" w:leader="none" w:pos="2635"/>
-        </w:tabs>
-        <w:spacing w:after="0" w:afterAutospacing="0" w:before="0" w:beforeAutospacing="0" w:line="240" w:lineRule="auto"/>
-        <w:ind/>
-        <w:contextualSpacing w:val="true"/>
-        <w:jc w:val="center"/>
-        <w:rPr>
-          <w:rFonts w:ascii="Times New Roman" w:hAnsi="Times New Roman" w:cs="Times New Roman"/>
-          <w:color w:val="000000" w:themeColor="text1"/>
-          <w:sz w:val="24"/>
-          <w:szCs w:val="24"/>
-        </w:rPr>
-      </w:pPr>
-      <w:r>
-        <w:rPr>
-          <w:rFonts w:ascii="Times New Roman" w:hAnsi="Times New Roman" w:eastAsia="Times New Roman" w:cs="Times New Roman"/>
-          <w:color w:val="000000" w:themeColor="text1"/>
-          <w:sz w:val="24"/>
-          <w:szCs w:val="24"/>
-        </w:rPr>
-        <w:t xml:space="preserve">{Assinatura Testemunha 2}</w:t>
-      </w:r>
-      <w:r>
-        <w:rPr>
-          <w:rFonts w:ascii="Times New Roman" w:hAnsi="Times New Roman" w:eastAsia="Times New Roman" w:cs="Times New Roman"/>
-          <w:color w:val="000000" w:themeColor="text1"/>
-          <w:sz w:val="24"/>
-          <w:szCs w:val="24"/>
-        </w:rPr>
-      </w:r>
-      <w:r>
-        <w:rPr>
-          <w:rFonts w:ascii="Times New Roman" w:hAnsi="Times New Roman" w:eastAsia="Times New Roman" w:cs="Times New Roman"/>
-          <w:color w:val="000000" w:themeColor="text1"/>
-          <w:sz w:val="24"/>
-          <w:szCs w:val="24"/>
-        </w:rPr>
-      </w:r>
-    </w:p>
-    <w:p>
-      <w:pPr>
-        <w:pStyle w:val="924"/>
-        <w:pBdr/>
-        <w:tabs>
-          <w:tab w:val="left" w:leader="none" w:pos="2635"/>
-        </w:tabs>
-        <w:spacing w:after="0" w:afterAutospacing="0" w:before="0" w:beforeAutospacing="0" w:line="240" w:lineRule="auto"/>
-        <w:ind/>
-        <w:contextualSpacing w:val="true"/>
-        <w:jc w:val="center"/>
-        <w:rPr>
-          <w:rFonts w:ascii="Times New Roman" w:hAnsi="Times New Roman" w:cs="Times New Roman"/>
-          <w:color w:val="000000" w:themeColor="text1"/>
-          <w:sz w:val="24"/>
-          <w:szCs w:val="24"/>
-        </w:rPr>
-      </w:pPr>
-      <w:r>
-        <w:rPr>
-          <w:rFonts w:ascii="Times New Roman" w:hAnsi="Times New Roman" w:eastAsia="Times New Roman" w:cs="Times New Roman"/>
-          <w:color w:val="000000" w:themeColor="text1"/>
-          <w:sz w:val="24"/>
-          <w:szCs w:val="24"/>
-        </w:rPr>
-        <w:t xml:space="preserve">{Testemunha 2}</w:t>
-      </w:r>
-      <w:r>
-        <w:rPr>
-          <w:rFonts w:ascii="Times New Roman" w:hAnsi="Times New Roman" w:eastAsia="Times New Roman" w:cs="Times New Roman"/>
-          <w:color w:val="000000" w:themeColor="text1"/>
-          <w:sz w:val="24"/>
-          <w:szCs w:val="24"/>
-        </w:rPr>
-      </w:r>
-      <w:r>
-        <w:rPr>
-          <w:rFonts w:ascii="Times New Roman" w:hAnsi="Times New Roman" w:eastAsia="Times New Roman" w:cs="Times New Roman"/>
-          <w:color w:val="000000" w:themeColor="text1"/>
-          <w:sz w:val="24"/>
-          <w:szCs w:val="24"/>
-        </w:rPr>
-      </w:r>
-    </w:p>
-    <w:p>
-      <w:pPr>
-        <w:pStyle w:val="924"/>
-        <w:pBdr/>
-        <w:tabs>
-          <w:tab w:val="left" w:leader="none" w:pos="2635"/>
-        </w:tabs>
-        <w:spacing w:after="0" w:afterAutospacing="0" w:before="0" w:beforeAutospacing="0" w:line="240" w:lineRule="auto"/>
-        <w:ind/>
-        <w:contextualSpacing w:val="true"/>
-        <w:jc w:val="center"/>
-        <w:rPr>
-          <w:rFonts w:ascii="Times New Roman" w:hAnsi="Times New Roman" w:eastAsia="Times New Roman" w:cs="Times New Roman"/>
           <w:color w:val="000000" w:themeColor="text1"/>
           <w:sz w:val="24"/>
           <w:szCs w:val="24"/>
@@ -3048,6 +2862,187 @@
       </w:r>
       <w:r>
         <w:rPr>
+          <w:rFonts w:ascii="Times New Roman" w:hAnsi="Times New Roman" w:cs="Times New Roman"/>
+          <w:color w:val="000000" w:themeColor="text1"/>
+          <w:sz w:val="24"/>
+          <w:szCs w:val="24"/>
+          <w:highlight w:val="none"/>
+        </w:rPr>
+      </w:r>
+    </w:p>
+    <w:p>
+      <w:pPr>
+        <w:pStyle w:val="924"/>
+        <w:pBdr/>
+        <w:tabs>
+          <w:tab w:val="left" w:leader="none" w:pos="2127"/>
+        </w:tabs>
+        <w:spacing w:after="28" w:afterAutospacing="0" w:before="0" w:beforeAutospacing="0" w:line="240" w:lineRule="auto"/>
+        <w:ind/>
+        <w:contextualSpacing w:val="true"/>
+        <w:jc w:val="center"/>
+        <w:rPr>
+          <w:rFonts w:ascii="Times New Roman" w:hAnsi="Times New Roman" w:cs="Times New Roman"/>
+          <w:color w:val="000000" w:themeColor="text1"/>
+          <w:sz w:val="24"/>
+          <w:szCs w:val="24"/>
+        </w:rPr>
+      </w:pPr>
+      <w:r>
+        <w:rPr>
+          <w:rFonts w:ascii="Times New Roman" w:hAnsi="Times New Roman" w:eastAsia="Times New Roman" w:cs="Times New Roman"/>
+          <w:color w:val="000000" w:themeColor="text1"/>
+          <w:sz w:val="24"/>
+          <w:szCs w:val="24"/>
+          <w:highlight w:val="none"/>
+        </w:rPr>
+      </w:r>
+      <w:r>
+        <w:rPr>
+          <w:rFonts w:ascii="Times New Roman" w:hAnsi="Times New Roman" w:eastAsia="Times New Roman" w:cs="Times New Roman"/>
+          <w:color w:val="000000" w:themeColor="text1"/>
+          <w:sz w:val="24"/>
+          <w:szCs w:val="24"/>
+        </w:rPr>
+      </w:r>
+      <w:r>
+        <w:rPr>
+          <w:rFonts w:ascii="Times New Roman" w:hAnsi="Times New Roman" w:cs="Times New Roman"/>
+          <w:color w:val="000000" w:themeColor="text1"/>
+          <w:sz w:val="24"/>
+          <w:szCs w:val="24"/>
+        </w:rPr>
+      </w:r>
+    </w:p>
+    <w:p>
+      <w:pPr>
+        <w:pStyle w:val="924"/>
+        <w:pBdr/>
+        <w:tabs>
+          <w:tab w:val="left" w:leader="none" w:pos="2635"/>
+        </w:tabs>
+        <w:spacing w:after="28" w:afterAutospacing="0" w:before="0" w:beforeAutospacing="0" w:line="240" w:lineRule="auto"/>
+        <w:ind/>
+        <w:contextualSpacing w:val="true"/>
+        <w:jc w:val="center"/>
+        <w:rPr>
+          <w:rFonts w:ascii="Times New Roman" w:hAnsi="Times New Roman" w:cs="Times New Roman"/>
+          <w:color w:val="000000" w:themeColor="text1"/>
+          <w:sz w:val="24"/>
+          <w:szCs w:val="24"/>
+        </w:rPr>
+      </w:pPr>
+      <w:r>
+        <w:rPr>
+          <w:rFonts w:ascii="Times New Roman" w:hAnsi="Times New Roman" w:eastAsia="Times New Roman" w:cs="Times New Roman"/>
+          <w:color w:val="000000" w:themeColor="text1"/>
+          <w:sz w:val="24"/>
+          <w:szCs w:val="24"/>
+        </w:rPr>
+        <w:t xml:space="preserve">{Assinatura Testemunha 2}</w:t>
+      </w:r>
+      <w:r>
+        <w:rPr>
+          <w:rFonts w:ascii="Times New Roman" w:hAnsi="Times New Roman" w:eastAsia="Times New Roman" w:cs="Times New Roman"/>
+          <w:color w:val="000000" w:themeColor="text1"/>
+          <w:sz w:val="24"/>
+          <w:szCs w:val="24"/>
+        </w:rPr>
+      </w:r>
+      <w:r>
+        <w:rPr>
+          <w:rFonts w:ascii="Times New Roman" w:hAnsi="Times New Roman" w:cs="Times New Roman"/>
+          <w:color w:val="000000" w:themeColor="text1"/>
+          <w:sz w:val="24"/>
+          <w:szCs w:val="24"/>
+        </w:rPr>
+      </w:r>
+    </w:p>
+    <w:p>
+      <w:pPr>
+        <w:pStyle w:val="924"/>
+        <w:pBdr/>
+        <w:tabs>
+          <w:tab w:val="left" w:leader="none" w:pos="2635"/>
+        </w:tabs>
+        <w:spacing w:after="28" w:afterAutospacing="0" w:before="0" w:beforeAutospacing="0" w:line="240" w:lineRule="auto"/>
+        <w:ind/>
+        <w:contextualSpacing w:val="true"/>
+        <w:jc w:val="center"/>
+        <w:rPr>
+          <w:rFonts w:ascii="Times New Roman" w:hAnsi="Times New Roman" w:cs="Times New Roman"/>
+          <w:color w:val="000000" w:themeColor="text1"/>
+          <w:sz w:val="24"/>
+          <w:szCs w:val="24"/>
+        </w:rPr>
+      </w:pPr>
+      <w:r>
+        <w:rPr>
+          <w:rFonts w:ascii="Times New Roman" w:hAnsi="Times New Roman" w:eastAsia="Times New Roman" w:cs="Times New Roman"/>
+          <w:color w:val="000000" w:themeColor="text1"/>
+          <w:sz w:val="24"/>
+          <w:szCs w:val="24"/>
+        </w:rPr>
+        <w:t xml:space="preserve">{Testemunha 2}</w:t>
+      </w:r>
+      <w:r>
+        <w:rPr>
+          <w:rFonts w:ascii="Times New Roman" w:hAnsi="Times New Roman" w:eastAsia="Times New Roman" w:cs="Times New Roman"/>
+          <w:color w:val="000000" w:themeColor="text1"/>
+          <w:sz w:val="24"/>
+          <w:szCs w:val="24"/>
+        </w:rPr>
+      </w:r>
+      <w:r>
+        <w:rPr>
+          <w:rFonts w:ascii="Times New Roman" w:hAnsi="Times New Roman" w:cs="Times New Roman"/>
+          <w:color w:val="000000" w:themeColor="text1"/>
+          <w:sz w:val="24"/>
+          <w:szCs w:val="24"/>
+        </w:rPr>
+      </w:r>
+    </w:p>
+    <w:p>
+      <w:pPr>
+        <w:pStyle w:val="924"/>
+        <w:pBdr/>
+        <w:tabs>
+          <w:tab w:val="left" w:leader="none" w:pos="2635"/>
+        </w:tabs>
+        <w:spacing w:after="28" w:afterAutospacing="0" w:before="0" w:beforeAutospacing="0" w:line="240" w:lineRule="auto"/>
+        <w:ind/>
+        <w:contextualSpacing w:val="true"/>
+        <w:jc w:val="center"/>
+        <w:rPr>
+          <w:rFonts w:ascii="Times New Roman" w:hAnsi="Times New Roman" w:eastAsia="Times New Roman" w:cs="Times New Roman"/>
+          <w:b/>
+          <w:bCs/>
+          <w:color w:val="000000" w:themeColor="text1"/>
+          <w:sz w:val="20"/>
+          <w:szCs w:val="20"/>
+        </w:rPr>
+      </w:pPr>
+      <w:r>
+        <w:rPr>
+          <w:rFonts w:ascii="Times New Roman" w:hAnsi="Times New Roman" w:eastAsia="Times New Roman" w:cs="Times New Roman"/>
+          <w:color w:val="000000" w:themeColor="text1"/>
+          <w:sz w:val="24"/>
+          <w:szCs w:val="24"/>
+        </w:rPr>
+        <w:t xml:space="preserve">Testemunha</w:t>
+      </w:r>
+      <w:r>
+        <w:rPr>
+          <w:rFonts w:ascii="Times New Roman" w:hAnsi="Times New Roman" w:eastAsia="Times New Roman" w:cs="Times New Roman"/>
+          <w:b/>
+          <w:bCs/>
+          <w:color w:val="000000" w:themeColor="text1"/>
+          <w:sz w:val="20"/>
+          <w:szCs w:val="20"/>
+        </w:rPr>
+      </w:r>
+      <w:r>
+        <w:rPr>
           <w:rFonts w:ascii="Times New Roman" w:hAnsi="Times New Roman" w:eastAsia="Times New Roman" w:cs="Times New Roman"/>
           <w:color w:val="000000" w:themeColor="text1"/>
           <w:sz w:val="24"/>
@@ -3058,20 +3053,21 @@
     </w:p>
     <w:p>
       <w:pPr>
-        <w:pStyle w:val="922"/>
+        <w:pStyle w:val="924"/>
         <w:pBdr/>
         <w:tabs>
-          <w:tab w:val="left" w:leader="none" w:pos="2880"/>
+          <w:tab w:val="left" w:leader="none" w:pos="2635"/>
         </w:tabs>
-        <w:spacing w:after="0" w:afterAutospacing="0" w:before="0" w:beforeAutospacing="0" w:line="240" w:lineRule="auto"/>
-        <w:ind/>
+        <w:spacing w:after="28" w:afterAutospacing="0" w:afterLines="0" w:before="0" w:beforeAutospacing="0" w:line="240" w:lineRule="auto"/>
+        <w:ind/>
+        <w:contextualSpacing w:val="true"/>
+        <w:jc w:val="left"/>
         <w:rPr>
-          <w:rFonts w:ascii="Times New Roman" w:hAnsi="Times New Roman" w:cs="Times New Roman"/>
-          <w:b/>
-          <w:bCs/>
+          <w:rFonts w:ascii="Times New Roman" w:hAnsi="Times New Roman" w:eastAsia="Times New Roman" w:cs="Times New Roman"/>
           <w:color w:val="000000" w:themeColor="text1"/>
-          <w:sz w:val="20"/>
-          <w:szCs w:val="20"/>
+          <w:sz w:val="24"/>
+          <w:szCs w:val="24"/>
+          <w:highlight w:val="none"/>
         </w:rPr>
       </w:pPr>
       <w:r>
@@ -3154,23 +3150,13 @@
       <w:r>
         <w:rPr>
           <w:rFonts w:ascii="Times New Roman" w:hAnsi="Times New Roman" w:eastAsia="Times New Roman" w:cs="Times New Roman"/>
-          <w:b/>
-          <w:bCs/>
           <w:color w:val="000000" w:themeColor="text1"/>
-          <w:sz w:val="20"/>
-          <w:szCs w:val="20"/>
+          <w:sz w:val="24"/>
+          <w:szCs w:val="24"/>
+          <w:highlight w:val="none"/>
         </w:rPr>
       </w:r>
-      <w:r>
-        <w:rPr>
-          <w:rFonts w:ascii="Times New Roman" w:hAnsi="Times New Roman" w:eastAsia="Times New Roman" w:cs="Times New Roman"/>
-          <w:b/>
-          <w:bCs/>
-          <w:color w:val="000000" w:themeColor="text1"/>
-          <w:sz w:val="20"/>
-          <w:szCs w:val="20"/>
-        </w:rPr>
-      </w:r>
+      <w:r/>
     </w:p>
     <w:sectPr>
       <w:headerReference w:type="default" r:id="rId8"/>

</xml_diff>

<commit_message>
romificação cmd base e exporta pdf
</commit_message>
<xml_diff>
--- a/GsdAutomatico/pdf/MODELO_NPD.docx
+++ b/GsdAutomatico/pdf/MODELO_NPD.docx
@@ -27,7 +27,7 @@
       </w:r>
       <w:r>
         <w:rPr>
-          <w:rFonts w:ascii="Times New Roman" w:hAnsi="Times New Roman" w:eastAsia="Times New Roman" w:cs="Times New Roman"/>
+          <w:rFonts w:ascii="Times New Roman" w:hAnsi="Times New Roman" w:cs="Times New Roman"/>
           <w:sz w:val="24"/>
           <w:szCs w:val="24"/>
         </w:rPr>
@@ -68,7 +68,7 @@
       </w:r>
       <w:r>
         <w:rPr>
-          <w:rFonts w:ascii="Times New Roman" w:hAnsi="Times New Roman" w:eastAsia="Times New Roman" w:cs="Times New Roman"/>
+          <w:rFonts w:ascii="Times New Roman" w:hAnsi="Times New Roman" w:cs="Times New Roman"/>
           <w:b w:val="0"/>
           <w:bCs w:val="0"/>
           <w:sz w:val="24"/>
@@ -113,7 +113,7 @@
       </w:r>
       <w:r>
         <w:rPr>
-          <w:rFonts w:ascii="Times New Roman" w:hAnsi="Times New Roman" w:eastAsia="Times New Roman" w:cs="Times New Roman"/>
+          <w:rFonts w:ascii="Times New Roman" w:hAnsi="Times New Roman" w:cs="Times New Roman"/>
           <w:b w:val="0"/>
           <w:bCs w:val="0"/>
           <w:sz w:val="24"/>
@@ -170,7 +170,7 @@
       </w:r>
       <w:r>
         <w:rPr>
-          <w:rFonts w:ascii="Times New Roman" w:hAnsi="Times New Roman" w:eastAsia="Times New Roman" w:cs="Times New Roman"/>
+          <w:rFonts w:ascii="Times New Roman" w:hAnsi="Times New Roman" w:cs="Times New Roman"/>
           <w:b w:val="0"/>
           <w:bCs w:val="0"/>
           <w:color w:val="ff0000"/>
@@ -243,11 +243,10 @@
       </w:r>
       <w:r>
         <w:rPr>
-          <w:rFonts w:ascii="Times New Roman" w:hAnsi="Times New Roman" w:eastAsia="Times New Roman" w:cs="Times New Roman"/>
+          <w:rFonts w:ascii="Times New Roman" w:hAnsi="Times New Roman" w:cs="Times New Roman"/>
           <w:b w:val="0"/>
           <w:bCs w:val="0"/>
           <w:i w:val="0"/>
-          <w:iCs w:val="0"/>
           <w:sz w:val="24"/>
           <w:szCs w:val="24"/>
         </w:rPr>
@@ -286,7 +285,7 @@
       </w:r>
       <w:r>
         <w:rPr>
-          <w:rFonts w:ascii="Times New Roman" w:hAnsi="Times New Roman" w:eastAsia="Times New Roman" w:cs="Times New Roman"/>
+          <w:rFonts w:ascii="Times New Roman" w:hAnsi="Times New Roman" w:cs="Times New Roman"/>
           <w:sz w:val="24"/>
           <w:szCs w:val="24"/>
         </w:rPr>
@@ -324,7 +323,7 @@
       </w:r>
       <w:r>
         <w:rPr>
-          <w:rFonts w:ascii="Times New Roman" w:hAnsi="Times New Roman" w:eastAsia="Times New Roman" w:cs="Times New Roman"/>
+          <w:rFonts w:ascii="Times New Roman" w:hAnsi="Times New Roman" w:cs="Times New Roman"/>
           <w:b w:val="0"/>
           <w:sz w:val="24"/>
           <w:szCs w:val="24"/>
@@ -363,10 +362,9 @@
       </w:r>
       <w:r>
         <w:rPr>
-          <w:rFonts w:ascii="Times New Roman" w:hAnsi="Times New Roman" w:eastAsia="Times New Roman" w:cs="Times New Roman"/>
+          <w:rFonts w:ascii="Times New Roman" w:hAnsi="Times New Roman" w:cs="Times New Roman"/>
           <w:sz w:val="24"/>
           <w:szCs w:val="24"/>
-          <w:lang w:eastAsia="en-US"/>
         </w:rPr>
       </w:r>
       <w:r>
@@ -422,7 +420,7 @@
       </w:r>
       <w:r>
         <w:rPr>
-          <w:rFonts w:ascii="Times New Roman" w:hAnsi="Times New Roman" w:eastAsia="Times New Roman" w:cs="Times New Roman"/>
+          <w:rFonts w:ascii="Times New Roman" w:hAnsi="Times New Roman" w:cs="Times New Roman"/>
           <w:bCs/>
           <w:color w:val="000000" w:themeColor="text1"/>
           <w:sz w:val="24"/>
@@ -469,7 +467,7 @@
       </w:r>
       <w:r>
         <w:rPr>
-          <w:rFonts w:ascii="Times New Roman" w:hAnsi="Times New Roman" w:eastAsia="Times New Roman" w:cs="Times New Roman"/>
+          <w:rFonts w:ascii="Times New Roman" w:hAnsi="Times New Roman" w:cs="Times New Roman"/>
           <w:b/>
           <w:bCs/>
           <w:color w:val="000000" w:themeColor="text1"/>
@@ -648,7 +646,7 @@
       </w:r>
       <w:r>
         <w:rPr>
-          <w:rFonts w:ascii="Times New Roman" w:hAnsi="Times New Roman" w:eastAsia="Times New Roman" w:cs="Times New Roman"/>
+          <w:rFonts w:ascii="Times New Roman" w:hAnsi="Times New Roman" w:cs="Times New Roman"/>
           <w:b/>
           <w:bCs/>
           <w:color w:val="000000" w:themeColor="text1"/>
@@ -694,7 +692,7 @@
       </w:r>
       <w:r>
         <w:rPr>
-          <w:rFonts w:ascii="Times New Roman" w:hAnsi="Times New Roman" w:eastAsia="Times New Roman" w:cs="Times New Roman"/>
+          <w:rFonts w:ascii="Times New Roman" w:hAnsi="Times New Roman" w:cs="Times New Roman"/>
           <w:b/>
           <w:bCs/>
           <w:sz w:val="24"/>
@@ -1666,7 +1664,7 @@
       </w:r>
       <w:r>
         <w:rPr>
-          <w:rFonts w:ascii="Times New Roman" w:hAnsi="Times New Roman" w:eastAsia="Times New Roman" w:cs="Times New Roman"/>
+          <w:rFonts w:ascii="Times New Roman" w:hAnsi="Times New Roman" w:cs="Times New Roman"/>
           <w:color w:val="000000" w:themeColor="text1"/>
           <w:sz w:val="24"/>
           <w:szCs w:val="24"/>
@@ -1760,7 +1758,7 @@
       </w:r>
       <w:r>
         <w:rPr>
-          <w:rFonts w:ascii="Times New Roman" w:hAnsi="Times New Roman" w:eastAsia="Times New Roman" w:cs="Times New Roman"/>
+          <w:rFonts w:ascii="Times New Roman" w:hAnsi="Times New Roman" w:cs="Times New Roman"/>
           <w:bCs/>
           <w:color w:val="ff0000"/>
           <w:sz w:val="24"/>
@@ -1799,7 +1797,7 @@
       </w:r>
       <w:r>
         <w:rPr>
-          <w:rFonts w:ascii="Times New Roman" w:hAnsi="Times New Roman" w:eastAsia="Times New Roman" w:cs="Times New Roman"/>
+          <w:rFonts w:ascii="Times New Roman" w:hAnsi="Times New Roman" w:cs="Times New Roman"/>
           <w:sz w:val="24"/>
           <w:szCs w:val="24"/>
         </w:rPr>
@@ -1835,7 +1833,7 @@
       </w:r>
       <w:r>
         <w:rPr>
-          <w:rFonts w:ascii="Times New Roman" w:hAnsi="Times New Roman" w:eastAsia="Times New Roman" w:cs="Times New Roman"/>
+          <w:rFonts w:ascii="Times New Roman" w:hAnsi="Times New Roman" w:cs="Times New Roman"/>
           <w:sz w:val="24"/>
           <w:szCs w:val="24"/>
         </w:rPr>
@@ -1878,7 +1876,7 @@
       </w:r>
       <w:r>
         <w:rPr>
-          <w:rFonts w:ascii="Times New Roman" w:hAnsi="Times New Roman" w:eastAsia="Times New Roman" w:cs="Times New Roman"/>
+          <w:rFonts w:ascii="Times New Roman" w:hAnsi="Times New Roman" w:cs="Times New Roman"/>
           <w:sz w:val="24"/>
           <w:szCs w:val="24"/>
         </w:rPr>
@@ -1916,7 +1914,7 @@
       </w:r>
       <w:r>
         <w:rPr>
-          <w:rFonts w:ascii="Times New Roman" w:hAnsi="Times New Roman" w:eastAsia="Times New Roman" w:cs="Times New Roman"/>
+          <w:rFonts w:ascii="Times New Roman" w:hAnsi="Times New Roman" w:cs="Times New Roman"/>
           <w:color w:val="000000" w:themeColor="text1"/>
           <w:sz w:val="24"/>
           <w:szCs w:val="24"/>
@@ -1939,7 +1937,9 @@
         <w:ind/>
         <w:jc w:val="center"/>
         <w:rPr>
-          <w:rFonts w:ascii="Times New Roman" w:hAnsi="Times New Roman" w:eastAsia="Times New Roman" w:cs="Times New Roman"/>
+          <w:rFonts w:ascii="Times New Roman" w:hAnsi="Times New Roman" w:cs="Times New Roman"/>
+          <w:b/>
+          <w:bCs/>
           <w:color w:val="000000" w:themeColor="text1"/>
           <w:sz w:val="24"/>
           <w:szCs w:val="24"/>
@@ -1992,6 +1992,55 @@
           <w:szCs w:val="24"/>
         </w:rPr>
       </w:r>
+      <w:r>
+        <w:rPr>
+          <w:rFonts w:ascii="Times New Roman" w:hAnsi="Times New Roman" w:eastAsia="Times New Roman" w:cs="Times New Roman"/>
+          <w:color w:val="000000" w:themeColor="text1"/>
+          <w:sz w:val="24"/>
+          <w:szCs w:val="24"/>
+          <w:highlight w:val="none"/>
+        </w:rPr>
+      </w:r>
+    </w:p>
+    <w:p>
+      <w:pPr>
+        <w:pStyle w:val="921"/>
+        <w:pBdr/>
+        <w:spacing w:after="28" w:afterAutospacing="0" w:before="0" w:beforeAutospacing="0" w:line="240" w:lineRule="auto"/>
+        <w:ind/>
+        <w:jc w:val="center"/>
+        <w:rPr>
+          <w:rFonts w:ascii="Times New Roman" w:hAnsi="Times New Roman" w:eastAsia="Times New Roman" w:cs="Times New Roman"/>
+          <w:b w:val="0"/>
+          <w:bCs w:val="0"/>
+          <w:color w:val="000000" w:themeColor="text1"/>
+          <w:sz w:val="24"/>
+          <w:szCs w:val="24"/>
+          <w:highlight w:val="none"/>
+        </w:rPr>
+      </w:pPr>
+      <w:r>
+        <w:rPr>
+          <w:rFonts w:ascii="Times New Roman" w:hAnsi="Times New Roman" w:cs="Times New Roman"/>
+          <w:b w:val="0"/>
+          <w:bCs w:val="0"/>
+          <w:color w:val="000000" w:themeColor="text1"/>
+          <w:sz w:val="24"/>
+          <w:szCs w:val="24"/>
+          <w:highlight w:val="none"/>
+        </w:rPr>
+      </w:r>
+      <w:r>
+        <w:rPr>
+          <w:rFonts w:ascii="Times New Roman" w:hAnsi="Times New Roman" w:eastAsia="Times New Roman" w:cs="Times New Roman"/>
+          <w:b w:val="0"/>
+          <w:bCs w:val="0"/>
+          <w:color w:val="000000" w:themeColor="text1"/>
+          <w:sz w:val="24"/>
+          <w:szCs w:val="24"/>
+          <w:highlight w:val="none"/>
+        </w:rPr>
+      </w:r>
     </w:p>
     <w:p>
       <w:pPr>
@@ -2017,6 +2066,7 @@
           <w:szCs w:val="24"/>
           <w:highlight w:val="none"/>
         </w:rPr>
+        <w:t xml:space="preserve">{nova_pagina}</w:t>
       </w:r>
       <w:r>
         <w:rPr>
@@ -2029,11 +2079,12 @@
       </w:r>
       <w:r>
         <w:rPr>
-          <w:rFonts w:ascii="Times New Roman" w:hAnsi="Times New Roman" w:eastAsia="Times New Roman" w:cs="Times New Roman"/>
+          <w:rFonts w:ascii="Times New Roman" w:hAnsi="Times New Roman" w:cs="Times New Roman"/>
+          <w:b/>
+          <w:bCs/>
           <w:color w:val="000000" w:themeColor="text1"/>
           <w:sz w:val="24"/>
           <w:szCs w:val="24"/>
-          <w:highlight w:val="none"/>
         </w:rPr>
       </w:r>
     </w:p>
@@ -2061,7 +2112,7 @@
       </w:r>
       <w:r>
         <w:rPr>
-          <w:rFonts w:ascii="Times New Roman" w:hAnsi="Times New Roman" w:eastAsia="Times New Roman" w:cs="Times New Roman"/>
+          <w:rFonts w:ascii="Times New Roman" w:hAnsi="Times New Roman" w:cs="Times New Roman"/>
           <w:b/>
           <w:sz w:val="24"/>
           <w:szCs w:val="24"/>
@@ -2213,7 +2264,7 @@
       </w:r>
       <w:r>
         <w:rPr>
-          <w:rFonts w:ascii="Times New Roman" w:hAnsi="Times New Roman" w:eastAsia="Times New Roman" w:cs="Times New Roman"/>
+          <w:rFonts w:ascii="Times New Roman" w:hAnsi="Times New Roman" w:cs="Times New Roman"/>
           <w:color w:val="000000" w:themeColor="text1"/>
           <w:sz w:val="24"/>
           <w:szCs w:val="24"/>
@@ -2250,7 +2301,7 @@
       </w:r>
       <w:r>
         <w:rPr>
-          <w:rFonts w:ascii="Times New Roman" w:hAnsi="Times New Roman" w:eastAsia="Times New Roman" w:cs="Times New Roman"/>
+          <w:rFonts w:ascii="Times New Roman" w:hAnsi="Times New Roman" w:cs="Times New Roman"/>
           <w:sz w:val="24"/>
           <w:szCs w:val="24"/>
         </w:rPr>
@@ -2341,43 +2392,10 @@
       </w:r>
       <w:r>
         <w:rPr>
-          <w:rFonts w:ascii="Times New Roman" w:hAnsi="Times New Roman" w:cs="Times New Roman"/>
-          <w:bCs/>
-          <w:sz w:val="24"/>
-          <w:szCs w:val="24"/>
-        </w:rPr>
-      </w:r>
-      <w:r>
-        <w:rPr>
           <w:rFonts w:ascii="Times New Roman" w:hAnsi="Times New Roman" w:eastAsia="Times New Roman" w:cs="Times New Roman"/>
           <w:sz w:val="24"/>
           <w:szCs w:val="24"/>
           <w:highlight w:val="none"/>
-        </w:rPr>
-      </w:r>
-      <w:r>
-        <w:rPr>
-          <w:rFonts w:ascii="Times New Roman" w:hAnsi="Times New Roman" w:eastAsia="Times New Roman" w:cs="Times New Roman"/>
-          <w:bCs/>
-          <w:sz w:val="24"/>
-          <w:szCs w:val="24"/>
-          <w:highlight w:val="none"/>
-        </w:rPr>
-      </w:r>
-      <w:r>
-        <w:rPr>
-          <w:rFonts w:ascii="Times New Roman" w:hAnsi="Times New Roman" w:eastAsia="Times New Roman" w:cs="Times New Roman"/>
-          <w:bCs/>
-          <w:sz w:val="24"/>
-          <w:szCs w:val="24"/>
-          <w:highlight w:val="none"/>
-        </w:rPr>
-      </w:r>
-      <w:r>
-        <w:rPr>
-          <w:rFonts w:ascii="Times New Roman" w:hAnsi="Times New Roman" w:cs="Times New Roman"/>
-          <w:sz w:val="24"/>
-          <w:szCs w:val="24"/>
         </w:rPr>
       </w:r>
       <w:r>
@@ -2416,7 +2434,7 @@
       </w:r>
       <w:r>
         <w:rPr>
-          <w:rFonts w:ascii="Times New Roman" w:hAnsi="Times New Roman" w:eastAsia="Times New Roman" w:cs="Times New Roman"/>
+          <w:rFonts w:ascii="Times New Roman" w:hAnsi="Times New Roman" w:cs="Times New Roman"/>
           <w:bCs/>
           <w:color w:val="000000" w:themeColor="text1"/>
           <w:sz w:val="24"/>
@@ -2459,7 +2477,7 @@
       </w:r>
       <w:r>
         <w:rPr>
-          <w:rFonts w:ascii="Times New Roman" w:hAnsi="Times New Roman" w:eastAsia="Times New Roman" w:cs="Times New Roman"/>
+          <w:rFonts w:ascii="Times New Roman" w:hAnsi="Times New Roman" w:cs="Times New Roman"/>
           <w:color w:val="000000" w:themeColor="text1"/>
           <w:sz w:val="24"/>
           <w:szCs w:val="24"/>
@@ -2504,7 +2522,7 @@
       </w:r>
       <w:r>
         <w:rPr>
-          <w:rFonts w:ascii="Times New Roman" w:hAnsi="Times New Roman" w:eastAsia="Times New Roman" w:cs="Times New Roman"/>
+          <w:rFonts w:ascii="Times New Roman" w:hAnsi="Times New Roman" w:cs="Times New Roman"/>
           <w:color w:val="000000" w:themeColor="text1"/>
           <w:sz w:val="24"/>
           <w:szCs w:val="24"/>
@@ -2550,7 +2568,7 @@
       </w:r>
       <w:r>
         <w:rPr>
-          <w:rFonts w:ascii="Times New Roman" w:hAnsi="Times New Roman" w:eastAsia="Times New Roman" w:cs="Times New Roman"/>
+          <w:rFonts w:ascii="Times New Roman" w:hAnsi="Times New Roman" w:cs="Times New Roman"/>
           <w:color w:val="000000" w:themeColor="text1"/>
           <w:sz w:val="24"/>
           <w:szCs w:val="24"/>
@@ -2592,7 +2610,7 @@
       </w:r>
       <w:r>
         <w:rPr>
-          <w:rFonts w:ascii="Times New Roman" w:hAnsi="Times New Roman" w:eastAsia="Times New Roman" w:cs="Times New Roman"/>
+          <w:rFonts w:ascii="Times New Roman" w:hAnsi="Times New Roman" w:cs="Times New Roman"/>
           <w:bCs/>
           <w:color w:val="000000" w:themeColor="text1"/>
           <w:sz w:val="24"/>
@@ -2635,7 +2653,7 @@
       </w:r>
       <w:r>
         <w:rPr>
-          <w:rFonts w:ascii="Times New Roman" w:hAnsi="Times New Roman" w:eastAsia="Times New Roman" w:cs="Times New Roman"/>
+          <w:rFonts w:ascii="Times New Roman" w:hAnsi="Times New Roman" w:cs="Times New Roman"/>
           <w:bCs/>
           <w:color w:val="000000" w:themeColor="text1"/>
           <w:sz w:val="24"/>
@@ -2678,7 +2696,7 @@
       </w:r>
       <w:r>
         <w:rPr>
-          <w:rFonts w:ascii="Times New Roman" w:hAnsi="Times New Roman" w:eastAsia="Times New Roman" w:cs="Times New Roman"/>
+          <w:rFonts w:ascii="Times New Roman" w:hAnsi="Times New Roman" w:cs="Times New Roman"/>
           <w:color w:val="000000" w:themeColor="text1"/>
           <w:sz w:val="24"/>
           <w:szCs w:val="24"/>
@@ -2720,7 +2738,7 @@
       </w:r>
       <w:r>
         <w:rPr>
-          <w:rFonts w:ascii="Times New Roman" w:hAnsi="Times New Roman" w:eastAsia="Times New Roman" w:cs="Times New Roman"/>
+          <w:rFonts w:ascii="Times New Roman" w:hAnsi="Times New Roman" w:cs="Times New Roman"/>
           <w:color w:val="000000" w:themeColor="text1"/>
           <w:sz w:val="24"/>
           <w:szCs w:val="24"/>
@@ -2764,7 +2782,7 @@
       </w:r>
       <w:r>
         <w:rPr>
-          <w:rFonts w:ascii="Times New Roman" w:hAnsi="Times New Roman" w:eastAsia="Times New Roman" w:cs="Times New Roman"/>
+          <w:rFonts w:ascii="Times New Roman" w:hAnsi="Times New Roman" w:cs="Times New Roman"/>
           <w:color w:val="000000" w:themeColor="text1"/>
           <w:sz w:val="24"/>
           <w:szCs w:val="24"/>
@@ -2808,7 +2826,7 @@
       </w:r>
       <w:r>
         <w:rPr>
-          <w:rFonts w:ascii="Times New Roman" w:hAnsi="Times New Roman" w:eastAsia="Times New Roman" w:cs="Times New Roman"/>
+          <w:rFonts w:ascii="Times New Roman" w:hAnsi="Times New Roman" w:cs="Times New Roman"/>
           <w:color w:val="000000" w:themeColor="text1"/>
           <w:sz w:val="24"/>
           <w:szCs w:val="24"/>
@@ -2840,6 +2858,186 @@
           <w:sz w:val="24"/>
           <w:szCs w:val="24"/>
           <w:highlight w:val="none"/>
+        </w:rPr>
+      </w:pPr>
+      <w:r>
+        <w:rPr>
+          <w:rFonts w:ascii="Times New Roman" w:hAnsi="Times New Roman" w:eastAsia="Times New Roman" w:cs="Times New Roman"/>
+          <w:color w:val="000000" w:themeColor="text1"/>
+          <w:sz w:val="24"/>
+          <w:szCs w:val="24"/>
+        </w:rPr>
+        <w:t xml:space="preserve">Testemunha</w:t>
+      </w:r>
+      <w:r>
+        <w:rPr>
+          <w:rFonts w:ascii="Times New Roman" w:hAnsi="Times New Roman" w:cs="Times New Roman"/>
+          <w:color w:val="000000" w:themeColor="text1"/>
+          <w:sz w:val="24"/>
+          <w:szCs w:val="24"/>
+          <w:highlight w:val="none"/>
+        </w:rPr>
+      </w:r>
+      <w:r>
+        <w:rPr>
+          <w:rFonts w:ascii="Times New Roman" w:hAnsi="Times New Roman" w:cs="Times New Roman"/>
+          <w:color w:val="000000" w:themeColor="text1"/>
+          <w:sz w:val="24"/>
+          <w:szCs w:val="24"/>
+          <w:highlight w:val="none"/>
+        </w:rPr>
+      </w:r>
+    </w:p>
+    <w:p>
+      <w:pPr>
+        <w:pStyle w:val="924"/>
+        <w:pBdr/>
+        <w:tabs>
+          <w:tab w:val="left" w:leader="none" w:pos="2127"/>
+        </w:tabs>
+        <w:spacing w:after="28" w:afterAutospacing="0" w:before="0" w:beforeAutospacing="0" w:line="240" w:lineRule="auto"/>
+        <w:ind/>
+        <w:contextualSpacing w:val="true"/>
+        <w:jc w:val="center"/>
+        <w:rPr>
+          <w:rFonts w:ascii="Times New Roman" w:hAnsi="Times New Roman" w:cs="Times New Roman"/>
+          <w:color w:val="000000" w:themeColor="text1"/>
+          <w:sz w:val="24"/>
+          <w:szCs w:val="24"/>
+        </w:rPr>
+      </w:pPr>
+      <w:r>
+        <w:rPr>
+          <w:rFonts w:ascii="Times New Roman" w:hAnsi="Times New Roman" w:eastAsia="Times New Roman" w:cs="Times New Roman"/>
+          <w:color w:val="000000" w:themeColor="text1"/>
+          <w:sz w:val="24"/>
+          <w:szCs w:val="24"/>
+          <w:highlight w:val="none"/>
+        </w:rPr>
+      </w:r>
+      <w:r>
+        <w:rPr>
+          <w:rFonts w:ascii="Times New Roman" w:hAnsi="Times New Roman" w:cs="Times New Roman"/>
+          <w:color w:val="000000" w:themeColor="text1"/>
+          <w:sz w:val="24"/>
+          <w:szCs w:val="24"/>
+        </w:rPr>
+      </w:r>
+      <w:r>
+        <w:rPr>
+          <w:rFonts w:ascii="Times New Roman" w:hAnsi="Times New Roman" w:cs="Times New Roman"/>
+          <w:color w:val="000000" w:themeColor="text1"/>
+          <w:sz w:val="24"/>
+          <w:szCs w:val="24"/>
+        </w:rPr>
+      </w:r>
+    </w:p>
+    <w:p>
+      <w:pPr>
+        <w:pStyle w:val="924"/>
+        <w:pBdr/>
+        <w:tabs>
+          <w:tab w:val="left" w:leader="none" w:pos="2635"/>
+        </w:tabs>
+        <w:spacing w:after="28" w:afterAutospacing="0" w:before="0" w:beforeAutospacing="0" w:line="240" w:lineRule="auto"/>
+        <w:ind/>
+        <w:contextualSpacing w:val="true"/>
+        <w:jc w:val="center"/>
+        <w:rPr>
+          <w:rFonts w:ascii="Times New Roman" w:hAnsi="Times New Roman" w:cs="Times New Roman"/>
+          <w:color w:val="000000" w:themeColor="text1"/>
+          <w:sz w:val="24"/>
+          <w:szCs w:val="24"/>
+        </w:rPr>
+      </w:pPr>
+      <w:r>
+        <w:rPr>
+          <w:rFonts w:ascii="Times New Roman" w:hAnsi="Times New Roman" w:eastAsia="Times New Roman" w:cs="Times New Roman"/>
+          <w:color w:val="000000" w:themeColor="text1"/>
+          <w:sz w:val="24"/>
+          <w:szCs w:val="24"/>
+        </w:rPr>
+        <w:t xml:space="preserve">{Assinatura Testemunha 2}</w:t>
+      </w:r>
+      <w:r>
+        <w:rPr>
+          <w:rFonts w:ascii="Times New Roman" w:hAnsi="Times New Roman" w:cs="Times New Roman"/>
+          <w:color w:val="000000" w:themeColor="text1"/>
+          <w:sz w:val="24"/>
+          <w:szCs w:val="24"/>
+        </w:rPr>
+      </w:r>
+      <w:r>
+        <w:rPr>
+          <w:rFonts w:ascii="Times New Roman" w:hAnsi="Times New Roman" w:cs="Times New Roman"/>
+          <w:color w:val="000000" w:themeColor="text1"/>
+          <w:sz w:val="24"/>
+          <w:szCs w:val="24"/>
+        </w:rPr>
+      </w:r>
+    </w:p>
+    <w:p>
+      <w:pPr>
+        <w:pStyle w:val="924"/>
+        <w:pBdr/>
+        <w:tabs>
+          <w:tab w:val="left" w:leader="none" w:pos="2635"/>
+        </w:tabs>
+        <w:spacing w:after="28" w:afterAutospacing="0" w:before="0" w:beforeAutospacing="0" w:line="240" w:lineRule="auto"/>
+        <w:ind/>
+        <w:contextualSpacing w:val="true"/>
+        <w:jc w:val="center"/>
+        <w:rPr>
+          <w:rFonts w:ascii="Times New Roman" w:hAnsi="Times New Roman" w:cs="Times New Roman"/>
+          <w:color w:val="000000" w:themeColor="text1"/>
+          <w:sz w:val="24"/>
+          <w:szCs w:val="24"/>
+        </w:rPr>
+      </w:pPr>
+      <w:r>
+        <w:rPr>
+          <w:rFonts w:ascii="Times New Roman" w:hAnsi="Times New Roman" w:eastAsia="Times New Roman" w:cs="Times New Roman"/>
+          <w:color w:val="000000" w:themeColor="text1"/>
+          <w:sz w:val="24"/>
+          <w:szCs w:val="24"/>
+        </w:rPr>
+        <w:t xml:space="preserve">{Testemunha 2}</w:t>
+      </w:r>
+      <w:r>
+        <w:rPr>
+          <w:rFonts w:ascii="Times New Roman" w:hAnsi="Times New Roman" w:cs="Times New Roman"/>
+          <w:color w:val="000000" w:themeColor="text1"/>
+          <w:sz w:val="24"/>
+          <w:szCs w:val="24"/>
+        </w:rPr>
+      </w:r>
+      <w:r>
+        <w:rPr>
+          <w:rFonts w:ascii="Times New Roman" w:hAnsi="Times New Roman" w:cs="Times New Roman"/>
+          <w:color w:val="000000" w:themeColor="text1"/>
+          <w:sz w:val="24"/>
+          <w:szCs w:val="24"/>
+        </w:rPr>
+      </w:r>
+    </w:p>
+    <w:p>
+      <w:pPr>
+        <w:pStyle w:val="924"/>
+        <w:pBdr/>
+        <w:tabs>
+          <w:tab w:val="left" w:leader="none" w:pos="2635"/>
+        </w:tabs>
+        <w:spacing w:after="28" w:afterAutospacing="0" w:before="0" w:beforeAutospacing="0" w:line="240" w:lineRule="auto"/>
+        <w:ind/>
+        <w:contextualSpacing w:val="true"/>
+        <w:jc w:val="center"/>
+        <w:rPr>
+          <w:rFonts w:ascii="Times New Roman" w:hAnsi="Times New Roman" w:eastAsia="Times New Roman" w:cs="Times New Roman"/>
+          <w:b/>
+          <w:bCs/>
+          <w:color w:val="000000" w:themeColor="text1"/>
+          <w:sz w:val="20"/>
+          <w:szCs w:val="20"/>
         </w:rPr>
       </w:pPr>
       <w:r>
@@ -2862,192 +3060,12 @@
       </w:r>
       <w:r>
         <w:rPr>
-          <w:rFonts w:ascii="Times New Roman" w:hAnsi="Times New Roman" w:cs="Times New Roman"/>
-          <w:color w:val="000000" w:themeColor="text1"/>
-          <w:sz w:val="24"/>
-          <w:szCs w:val="24"/>
-          <w:highlight w:val="none"/>
-        </w:rPr>
-      </w:r>
-    </w:p>
-    <w:p>
-      <w:pPr>
-        <w:pStyle w:val="924"/>
-        <w:pBdr/>
-        <w:tabs>
-          <w:tab w:val="left" w:leader="none" w:pos="2127"/>
-        </w:tabs>
-        <w:spacing w:after="28" w:afterAutospacing="0" w:before="0" w:beforeAutospacing="0" w:line="240" w:lineRule="auto"/>
-        <w:ind/>
-        <w:contextualSpacing w:val="true"/>
-        <w:jc w:val="center"/>
-        <w:rPr>
-          <w:rFonts w:ascii="Times New Roman" w:hAnsi="Times New Roman" w:cs="Times New Roman"/>
-          <w:color w:val="000000" w:themeColor="text1"/>
-          <w:sz w:val="24"/>
-          <w:szCs w:val="24"/>
-        </w:rPr>
-      </w:pPr>
-      <w:r>
-        <w:rPr>
-          <w:rFonts w:ascii="Times New Roman" w:hAnsi="Times New Roman" w:eastAsia="Times New Roman" w:cs="Times New Roman"/>
-          <w:color w:val="000000" w:themeColor="text1"/>
-          <w:sz w:val="24"/>
-          <w:szCs w:val="24"/>
-          <w:highlight w:val="none"/>
-        </w:rPr>
-      </w:r>
-      <w:r>
-        <w:rPr>
-          <w:rFonts w:ascii="Times New Roman" w:hAnsi="Times New Roman" w:eastAsia="Times New Roman" w:cs="Times New Roman"/>
-          <w:color w:val="000000" w:themeColor="text1"/>
-          <w:sz w:val="24"/>
-          <w:szCs w:val="24"/>
-        </w:rPr>
-      </w:r>
-      <w:r>
-        <w:rPr>
-          <w:rFonts w:ascii="Times New Roman" w:hAnsi="Times New Roman" w:cs="Times New Roman"/>
-          <w:color w:val="000000" w:themeColor="text1"/>
-          <w:sz w:val="24"/>
-          <w:szCs w:val="24"/>
-        </w:rPr>
-      </w:r>
-    </w:p>
-    <w:p>
-      <w:pPr>
-        <w:pStyle w:val="924"/>
-        <w:pBdr/>
-        <w:tabs>
-          <w:tab w:val="left" w:leader="none" w:pos="2635"/>
-        </w:tabs>
-        <w:spacing w:after="28" w:afterAutospacing="0" w:before="0" w:beforeAutospacing="0" w:line="240" w:lineRule="auto"/>
-        <w:ind/>
-        <w:contextualSpacing w:val="true"/>
-        <w:jc w:val="center"/>
-        <w:rPr>
-          <w:rFonts w:ascii="Times New Roman" w:hAnsi="Times New Roman" w:cs="Times New Roman"/>
-          <w:color w:val="000000" w:themeColor="text1"/>
-          <w:sz w:val="24"/>
-          <w:szCs w:val="24"/>
-        </w:rPr>
-      </w:pPr>
-      <w:r>
-        <w:rPr>
-          <w:rFonts w:ascii="Times New Roman" w:hAnsi="Times New Roman" w:eastAsia="Times New Roman" w:cs="Times New Roman"/>
-          <w:color w:val="000000" w:themeColor="text1"/>
-          <w:sz w:val="24"/>
-          <w:szCs w:val="24"/>
-        </w:rPr>
-        <w:t xml:space="preserve">{Assinatura Testemunha 2}</w:t>
-      </w:r>
-      <w:r>
-        <w:rPr>
-          <w:rFonts w:ascii="Times New Roman" w:hAnsi="Times New Roman" w:eastAsia="Times New Roman" w:cs="Times New Roman"/>
-          <w:color w:val="000000" w:themeColor="text1"/>
-          <w:sz w:val="24"/>
-          <w:szCs w:val="24"/>
-        </w:rPr>
-      </w:r>
-      <w:r>
-        <w:rPr>
-          <w:rFonts w:ascii="Times New Roman" w:hAnsi="Times New Roman" w:cs="Times New Roman"/>
-          <w:color w:val="000000" w:themeColor="text1"/>
-          <w:sz w:val="24"/>
-          <w:szCs w:val="24"/>
-        </w:rPr>
-      </w:r>
-    </w:p>
-    <w:p>
-      <w:pPr>
-        <w:pStyle w:val="924"/>
-        <w:pBdr/>
-        <w:tabs>
-          <w:tab w:val="left" w:leader="none" w:pos="2635"/>
-        </w:tabs>
-        <w:spacing w:after="28" w:afterAutospacing="0" w:before="0" w:beforeAutospacing="0" w:line="240" w:lineRule="auto"/>
-        <w:ind/>
-        <w:contextualSpacing w:val="true"/>
-        <w:jc w:val="center"/>
-        <w:rPr>
-          <w:rFonts w:ascii="Times New Roman" w:hAnsi="Times New Roman" w:cs="Times New Roman"/>
-          <w:color w:val="000000" w:themeColor="text1"/>
-          <w:sz w:val="24"/>
-          <w:szCs w:val="24"/>
-        </w:rPr>
-      </w:pPr>
-      <w:r>
-        <w:rPr>
-          <w:rFonts w:ascii="Times New Roman" w:hAnsi="Times New Roman" w:eastAsia="Times New Roman" w:cs="Times New Roman"/>
-          <w:color w:val="000000" w:themeColor="text1"/>
-          <w:sz w:val="24"/>
-          <w:szCs w:val="24"/>
-        </w:rPr>
-        <w:t xml:space="preserve">{Testemunha 2}</w:t>
-      </w:r>
-      <w:r>
-        <w:rPr>
-          <w:rFonts w:ascii="Times New Roman" w:hAnsi="Times New Roman" w:eastAsia="Times New Roman" w:cs="Times New Roman"/>
-          <w:color w:val="000000" w:themeColor="text1"/>
-          <w:sz w:val="24"/>
-          <w:szCs w:val="24"/>
-        </w:rPr>
-      </w:r>
-      <w:r>
-        <w:rPr>
-          <w:rFonts w:ascii="Times New Roman" w:hAnsi="Times New Roman" w:cs="Times New Roman"/>
-          <w:color w:val="000000" w:themeColor="text1"/>
-          <w:sz w:val="24"/>
-          <w:szCs w:val="24"/>
-        </w:rPr>
-      </w:r>
-    </w:p>
-    <w:p>
-      <w:pPr>
-        <w:pStyle w:val="924"/>
-        <w:pBdr/>
-        <w:tabs>
-          <w:tab w:val="left" w:leader="none" w:pos="2635"/>
-        </w:tabs>
-        <w:spacing w:after="28" w:afterAutospacing="0" w:before="0" w:beforeAutospacing="0" w:line="240" w:lineRule="auto"/>
-        <w:ind/>
-        <w:contextualSpacing w:val="true"/>
-        <w:jc w:val="center"/>
-        <w:rPr>
           <w:rFonts w:ascii="Times New Roman" w:hAnsi="Times New Roman" w:eastAsia="Times New Roman" w:cs="Times New Roman"/>
           <w:b/>
           <w:bCs/>
           <w:color w:val="000000" w:themeColor="text1"/>
           <w:sz w:val="20"/>
           <w:szCs w:val="20"/>
-        </w:rPr>
-      </w:pPr>
-      <w:r>
-        <w:rPr>
-          <w:rFonts w:ascii="Times New Roman" w:hAnsi="Times New Roman" w:eastAsia="Times New Roman" w:cs="Times New Roman"/>
-          <w:color w:val="000000" w:themeColor="text1"/>
-          <w:sz w:val="24"/>
-          <w:szCs w:val="24"/>
-        </w:rPr>
-        <w:t xml:space="preserve">Testemunha</w:t>
-      </w:r>
-      <w:r>
-        <w:rPr>
-          <w:rFonts w:ascii="Times New Roman" w:hAnsi="Times New Roman" w:eastAsia="Times New Roman" w:cs="Times New Roman"/>
-          <w:b/>
-          <w:bCs/>
-          <w:color w:val="000000" w:themeColor="text1"/>
-          <w:sz w:val="20"/>
-          <w:szCs w:val="20"/>
-        </w:rPr>
-      </w:r>
-      <w:r>
-        <w:rPr>
-          <w:rFonts w:ascii="Times New Roman" w:hAnsi="Times New Roman" w:eastAsia="Times New Roman" w:cs="Times New Roman"/>
-          <w:color w:val="000000" w:themeColor="text1"/>
-          <w:sz w:val="24"/>
-          <w:szCs w:val="24"/>
-          <w:highlight w:val="none"/>
         </w:rPr>
       </w:r>
     </w:p>
@@ -3156,7 +3174,15 @@
           <w:highlight w:val="none"/>
         </w:rPr>
       </w:r>
-      <w:r/>
+      <w:r>
+        <w:rPr>
+          <w:rFonts w:ascii="Times New Roman" w:hAnsi="Times New Roman" w:eastAsia="Times New Roman" w:cs="Times New Roman"/>
+          <w:color w:val="000000" w:themeColor="text1"/>
+          <w:sz w:val="24"/>
+          <w:szCs w:val="24"/>
+          <w:highlight w:val="none"/>
+        </w:rPr>
+      </w:r>
     </w:p>
     <w:sectPr>
       <w:headerReference w:type="default" r:id="rId8"/>

</xml_diff>